<commit_message>
Add scenario lab and index guide
</commit_message>
<xml_diff>
--- a/portfolio_analysis_pm_report.docx
+++ b/portfolio_analysis_pm_report.docx
@@ -14,7 +14,7 @@
         <w:rPr>
           <w:rFonts w:hint="eastAsia"/>
         </w:rPr>
-        <w:t xml:space="preserve">支持的投资组合分析工具</w:t>
+        <w:t>支援的投資組合分析工具</w:t>
       </w:r>
     </w:p>
     <w:bookmarkStart w:id="86" w:name="项目完整报告"/>
@@ -26,7 +26,7 @@
         <w:rPr>
           <w:rFonts w:hint="eastAsia"/>
         </w:rPr>
-        <w:t xml:space="preserve">项目完整报告</w:t>
+        <w:t>專案完整報告</w:t>
       </w:r>
     </w:p>
     <w:bookmarkStart w:id="20" w:name="项目概述"/>
@@ -41,7 +41,7 @@
         <w:rPr>
           <w:rFonts w:hint="eastAsia"/>
         </w:rPr>
-        <w:t xml:space="preserve">项目概述</w:t>
+        <w:t>專案概述</w:t>
       </w:r>
     </w:p>
     <w:p>
@@ -54,7 +54,7 @@
           <w:b/>
           <w:bCs/>
         </w:rPr>
-        <w:t xml:space="preserve">项目名称</w:t>
+        <w:t>專案名稱</w:t>
       </w:r>
       <w:r>
         <w:br/>
@@ -66,7 +66,7 @@
         <w:rPr>
           <w:rFonts w:hint="eastAsia"/>
         </w:rPr>
-        <w:t xml:space="preserve">支持的投资组合分析工具</w:t>
+        <w:t>支援的投資組合分析工具</w:t>
       </w:r>
     </w:p>
     <w:p>
@@ -79,13 +79,13 @@
           <w:b/>
           <w:bCs/>
         </w:rPr>
-        <w:t xml:space="preserve">英文名称</w:t>
+        <w:t>英文名稱</w:t>
       </w:r>
       <w:r>
         <w:br/>
       </w:r>
       <w:r>
-        <w:t xml:space="preserve">AI-Enhanced Portfolio Analysis Tool</w:t>
+        <w:t>AI-Enhanced Portfolio Analysis Tool</w:t>
       </w:r>
     </w:p>
     <w:p>
@@ -98,7 +98,7 @@
           <w:b/>
           <w:bCs/>
         </w:rPr>
-        <w:t xml:space="preserve">项目类型</w:t>
+        <w:t>專案型別</w:t>
       </w:r>
       <w:r>
         <w:br/>
@@ -107,7 +107,7 @@
         <w:rPr>
           <w:rFonts w:hint="eastAsia"/>
         </w:rPr>
-        <w:t xml:space="preserve">金融科技</w:t>
+        <w:t>金融科技</w:t>
       </w:r>
       <w:r>
         <w:t xml:space="preserve"> / </w:t>
@@ -116,7 +116,7 @@
         <w:rPr>
           <w:rFonts w:hint="eastAsia"/>
         </w:rPr>
-        <w:t xml:space="preserve">数据科学</w:t>
+        <w:t>資料科學</w:t>
       </w:r>
       <w:r>
         <w:t xml:space="preserve"> / AI </w:t>
@@ -125,7 +125,7 @@
         <w:rPr>
           <w:rFonts w:hint="eastAsia"/>
         </w:rPr>
-        <w:t xml:space="preserve">应用型</w:t>
+        <w:t>應用型</w:t>
       </w:r>
       <w:r>
         <w:t xml:space="preserve"> Side Project</w:t>
@@ -141,7 +141,7 @@
           <w:b/>
           <w:bCs/>
         </w:rPr>
-        <w:t xml:space="preserve">项目背景</w:t>
+        <w:t>專案背景</w:t>
       </w:r>
       <w:r>
         <w:br/>
@@ -150,7 +150,7 @@
         <w:rPr>
           <w:rFonts w:hint="eastAsia"/>
         </w:rPr>
-        <w:t xml:space="preserve">本项目旨在设计并开发一个面向学生作品集展示、求职展示以及个人学习实践的金融分析工具。用户可以输入股票或</w:t>
+        <w:t>本專案旨在設計並開發一個面向學生作品集展示、求職展示以及個人學習實踐的金融分析工具。使用者可以輸入股票或</w:t>
       </w:r>
       <w:r>
         <w:t xml:space="preserve"> ETF </w:t>
@@ -159,7 +159,7 @@
         <w:rPr>
           <w:rFonts w:hint="eastAsia"/>
         </w:rPr>
-        <w:t xml:space="preserve">的代码及配置权重，系统将基于公开市场历史价格数据，对投资组合进行收益、风险和分散化分析，并通过</w:t>
+        <w:t>的程式碼及配置權重，系統將基於公開市場歷史價格資料，對投資組合進行收益、風險和分散化分析，並透過</w:t>
       </w:r>
       <w:r>
         <w:t xml:space="preserve"> AI </w:t>
@@ -168,7 +168,7 @@
         <w:rPr>
           <w:rFonts w:hint="eastAsia"/>
         </w:rPr>
-        <w:t xml:space="preserve">自动生成自然语言分析报告，帮助用户理解组合特征与潜在问题。</w:t>
+        <w:t>自動生成自然語言分析報告，幫助使用者理解組合特徵與潛在問題。</w:t>
       </w:r>
     </w:p>
     <w:p>
@@ -179,7 +179,7 @@
         <w:rPr>
           <w:rFonts w:hint="eastAsia"/>
         </w:rPr>
-        <w:t xml:space="preserve">该项目的核心价值在于，它不依赖真实客户隐私数据，也不需要机构级交易系统支持，但仍能够较好地体现以下能力：</w:t>
+        <w:t>該專案的核心價值在於，它不依賴真實客戶隱私資料，也不需要機構級交易系統支援，但仍能夠較好地體現以下能力：</w:t>
       </w:r>
     </w:p>
     <w:p>
@@ -194,7 +194,7 @@
         <w:rPr>
           <w:rFonts w:hint="eastAsia"/>
         </w:rPr>
-        <w:t xml:space="preserve">金融领域知识：投资组合、收益、波动率、回撤、风险收益比、资产配置</w:t>
+        <w:t>金融領域知識：投資組合、收益、波動率、回撤、風險收益比、資產配置</w:t>
       </w:r>
     </w:p>
     <w:p>
@@ -209,7 +209,7 @@
         <w:rPr>
           <w:rFonts w:hint="eastAsia"/>
         </w:rPr>
-        <w:t xml:space="preserve">数据科学能力：数据抓取、数据清洗、时间序列处理、指标计算、可视化分析</w:t>
+        <w:t>資料科學能力：資料抓取、資料清洗、時間序列處理、指標計算、視覺化分析</w:t>
       </w:r>
     </w:p>
     <w:p>
@@ -227,7 +227,7 @@
         <w:rPr>
           <w:rFonts w:hint="eastAsia"/>
         </w:rPr>
-        <w:t xml:space="preserve">应用能力：将分析结果转化为自然语言解释和辅助决策洞察</w:t>
+        <w:t>應用能力：將分析結果轉化為自然語言解釋和輔助決策洞察</w:t>
       </w:r>
     </w:p>
     <w:p>
@@ -240,7 +240,7 @@
           <w:b/>
           <w:bCs/>
         </w:rPr>
-        <w:t xml:space="preserve">项目愿景</w:t>
+        <w:t>專案願景</w:t>
       </w:r>
       <w:r>
         <w:br/>
@@ -249,7 +249,7 @@
         <w:rPr>
           <w:rFonts w:hint="eastAsia"/>
         </w:rPr>
-        <w:t xml:space="preserve">构建一个轻量、专业、可扩展的智能投资组合分析平台，作为面向初级投资者、学生或求职者的分析与展示工具。</w:t>
+        <w:t>構建一個輕量、專業、可擴充套件的智慧投資組合分析平臺，作為面向初級投資者、學生或求職者的分析與展示工具。</w:t>
       </w:r>
     </w:p>
     <w:bookmarkEnd w:id="20"/>
@@ -265,7 +265,7 @@
         <w:rPr>
           <w:rFonts w:hint="eastAsia"/>
         </w:rPr>
-        <w:t xml:space="preserve">项目目标</w:t>
+        <w:t>專案目標</w:t>
       </w:r>
     </w:p>
     <w:bookmarkStart w:id="21" w:name="业务目标"/>
@@ -280,7 +280,7 @@
         <w:rPr>
           <w:rFonts w:hint="eastAsia"/>
         </w:rPr>
-        <w:t xml:space="preserve">业务目标</w:t>
+        <w:t>業務目標</w:t>
       </w:r>
     </w:p>
     <w:p>
@@ -295,7 +295,7 @@
         <w:rPr>
           <w:rFonts w:hint="eastAsia"/>
         </w:rPr>
-        <w:t xml:space="preserve">提供一个可交互的投资组合分析工具，帮助用户理解其资产配置表现与风险特征</w:t>
+        <w:t>提供一個可互動的投資組合分析工具，幫助使用者理解其資產配置表現與風險特徵</w:t>
       </w:r>
     </w:p>
     <w:p>
@@ -310,7 +310,7 @@
         <w:rPr>
           <w:rFonts w:hint="eastAsia"/>
         </w:rPr>
-        <w:t xml:space="preserve">通过</w:t>
+        <w:t>透過</w:t>
       </w:r>
       <w:r>
         <w:t xml:space="preserve"> AI </w:t>
@@ -319,7 +319,7 @@
         <w:rPr>
           <w:rFonts w:hint="eastAsia"/>
         </w:rPr>
-        <w:t xml:space="preserve">自动解释复杂金融指标，降低用户理解门槛</w:t>
+        <w:t>自動解釋複雜金融指標，降低使用者理解門檻</w:t>
       </w:r>
     </w:p>
     <w:p>
@@ -334,7 +334,7 @@
         <w:rPr>
           <w:rFonts w:hint="eastAsia"/>
         </w:rPr>
-        <w:t xml:space="preserve">打造一个可用于作品集、求职展示和演示汇报的完整产品</w:t>
+        <w:t>打造一個可用於作品集、求職展示和演示彙報的完整產品</w:t>
       </w:r>
       <w:r>
         <w:t xml:space="preserve"> Demo</w:t>
@@ -353,7 +353,7 @@
         <w:rPr>
           <w:rFonts w:hint="eastAsia"/>
         </w:rPr>
-        <w:t xml:space="preserve">产品目标</w:t>
+        <w:t>產品目標</w:t>
       </w:r>
     </w:p>
     <w:p>
@@ -368,7 +368,7 @@
         <w:rPr>
           <w:rFonts w:hint="eastAsia"/>
         </w:rPr>
-        <w:t xml:space="preserve">实现投资组合输入、分析计算、可视化展示和</w:t>
+        <w:t>實現投資組合輸入、分析計算、視覺化展示和</w:t>
       </w:r>
       <w:r>
         <w:t xml:space="preserve"> AI </w:t>
@@ -377,7 +377,7 @@
         <w:rPr>
           <w:rFonts w:hint="eastAsia"/>
         </w:rPr>
-        <w:t xml:space="preserve">解读的一站式流程</w:t>
+        <w:t>解讀的一站式流程</w:t>
       </w:r>
     </w:p>
     <w:p>
@@ -392,7 +392,7 @@
         <w:rPr>
           <w:rFonts w:hint="eastAsia"/>
         </w:rPr>
-        <w:t xml:space="preserve">通过清晰的</w:t>
+        <w:t>透過清晰的</w:t>
       </w:r>
       <w:r>
         <w:t xml:space="preserve"> dashboard </w:t>
@@ -401,7 +401,7 @@
         <w:rPr>
           <w:rFonts w:hint="eastAsia"/>
         </w:rPr>
-        <w:t xml:space="preserve">呈现关键财务指标与风险信息</w:t>
+        <w:t>呈現關鍵財務指標與風險資訊</w:t>
       </w:r>
     </w:p>
     <w:p>
@@ -416,7 +416,7 @@
         <w:rPr>
           <w:rFonts w:hint="eastAsia"/>
         </w:rPr>
-        <w:t xml:space="preserve">提供简洁直观的用户体验，使非专业用户也能理解输出结果</w:t>
+        <w:t>提供簡潔直觀的使用者體驗，使非專業使用者也能理解輸出結果</w:t>
       </w:r>
     </w:p>
     <w:bookmarkEnd w:id="22"/>
@@ -432,7 +432,7 @@
         <w:rPr>
           <w:rFonts w:hint="eastAsia"/>
         </w:rPr>
-        <w:t xml:space="preserve">学习目标</w:t>
+        <w:t>學習目標</w:t>
       </w:r>
     </w:p>
     <w:p>
@@ -447,7 +447,7 @@
         <w:rPr>
           <w:rFonts w:hint="eastAsia"/>
         </w:rPr>
-        <w:t xml:space="preserve">练习金融数据分析与时间序列处理</w:t>
+        <w:t>練習金融資料分析與時間序列處理</w:t>
       </w:r>
     </w:p>
     <w:p>
@@ -462,7 +462,7 @@
         <w:rPr>
           <w:rFonts w:hint="eastAsia"/>
         </w:rPr>
-        <w:t xml:space="preserve">提升前后端联动和产品化交付能力</w:t>
+        <w:t>提升前後端聯動和產品化交付能力</w:t>
       </w:r>
     </w:p>
     <w:p>
@@ -477,7 +477,7 @@
         <w:rPr>
           <w:rFonts w:hint="eastAsia"/>
         </w:rPr>
-        <w:t xml:space="preserve">熟悉</w:t>
+        <w:t>熟悉</w:t>
       </w:r>
       <w:r>
         <w:t xml:space="preserve"> AI </w:t>
@@ -486,7 +486,7 @@
         <w:rPr>
           <w:rFonts w:hint="eastAsia"/>
         </w:rPr>
-        <w:t xml:space="preserve">在金融分析说明场景下的应用方式</w:t>
+        <w:t>在金融分析說明場景下的應用方式</w:t>
       </w:r>
     </w:p>
     <w:bookmarkEnd w:id="23"/>
@@ -503,7 +503,7 @@
         <w:rPr>
           <w:rFonts w:hint="eastAsia"/>
         </w:rPr>
-        <w:t xml:space="preserve">项目范围</w:t>
+        <w:t>專案範圍</w:t>
       </w:r>
     </w:p>
     <w:bookmarkStart w:id="25" w:name="in-scope"/>
@@ -512,7 +512,7 @@
         <w:pStyle w:val="Heading4"/>
       </w:pPr>
       <w:r>
-        <w:t xml:space="preserve">3.1 In Scope</w:t>
+        <w:t>3.1 In Scope</w:t>
       </w:r>
     </w:p>
     <w:p>
@@ -527,7 +527,7 @@
         <w:rPr>
           <w:rFonts w:hint="eastAsia"/>
         </w:rPr>
-        <w:t xml:space="preserve">用户输入股票</w:t>
+        <w:t>使用者輸入股票</w:t>
       </w:r>
       <w:r>
         <w:t xml:space="preserve"> / ETF ticker </w:t>
@@ -536,7 +536,7 @@
         <w:rPr>
           <w:rFonts w:hint="eastAsia"/>
         </w:rPr>
-        <w:t xml:space="preserve">与权重</w:t>
+        <w:t>與權重</w:t>
       </w:r>
     </w:p>
     <w:p>
@@ -551,7 +551,7 @@
         <w:rPr>
           <w:rFonts w:hint="eastAsia"/>
         </w:rPr>
-        <w:t xml:space="preserve">获取公开市场历史价格数据</w:t>
+        <w:t>獲取公開市場歷史價格資料</w:t>
       </w:r>
     </w:p>
     <w:p>
@@ -566,7 +566,7 @@
         <w:rPr>
           <w:rFonts w:hint="eastAsia"/>
         </w:rPr>
-        <w:t xml:space="preserve">计算投资组合收益与基础风险指标</w:t>
+        <w:t>計算投資組合收益與基礎風險指標</w:t>
       </w:r>
     </w:p>
     <w:p>
@@ -581,7 +581,7 @@
         <w:rPr>
           <w:rFonts w:hint="eastAsia"/>
         </w:rPr>
-        <w:t xml:space="preserve">展示组合表现、回撤、相关性与配置结构</w:t>
+        <w:t>展示組合表現、回撤、相關性與配置結構</w:t>
       </w:r>
     </w:p>
     <w:p>
@@ -596,7 +596,7 @@
         <w:rPr>
           <w:rFonts w:hint="eastAsia"/>
         </w:rPr>
-        <w:t xml:space="preserve">与</w:t>
+        <w:t>與</w:t>
       </w:r>
       <w:r>
         <w:t xml:space="preserve"> benchmark </w:t>
@@ -605,7 +605,7 @@
         <w:rPr>
           <w:rFonts w:hint="eastAsia"/>
         </w:rPr>
-        <w:t xml:space="preserve">做对比分析</w:t>
+        <w:t>做對比分析</w:t>
       </w:r>
     </w:p>
     <w:p>
@@ -620,7 +620,7 @@
         <w:rPr>
           <w:rFonts w:hint="eastAsia"/>
         </w:rPr>
-        <w:t xml:space="preserve">生成</w:t>
+        <w:t>生成</w:t>
       </w:r>
       <w:r>
         <w:t xml:space="preserve"> AI </w:t>
@@ -629,7 +629,7 @@
         <w:rPr>
           <w:rFonts w:hint="eastAsia"/>
         </w:rPr>
-        <w:t xml:space="preserve">自然语言总结</w:t>
+        <w:t>自然語言總結</w:t>
       </w:r>
     </w:p>
     <w:p>
@@ -644,7 +644,7 @@
         <w:rPr>
           <w:rFonts w:hint="eastAsia"/>
         </w:rPr>
-        <w:t xml:space="preserve">提供基础响应式</w:t>
+        <w:t>提供基礎響應式</w:t>
       </w:r>
       <w:r>
         <w:t xml:space="preserve"> Web </w:t>
@@ -653,7 +653,7 @@
         <w:rPr>
           <w:rFonts w:hint="eastAsia"/>
         </w:rPr>
-        <w:t xml:space="preserve">界面</w:t>
+        <w:t>介面</w:t>
       </w:r>
     </w:p>
     <w:bookmarkEnd w:id="25"/>
@@ -663,7 +663,7 @@
         <w:pStyle w:val="Heading4"/>
       </w:pPr>
       <w:r>
-        <w:t xml:space="preserve">3.2 Out of Scope</w:t>
+        <w:t>3.2 Out of Scope</w:t>
       </w:r>
     </w:p>
     <w:p>
@@ -678,7 +678,7 @@
         <w:rPr>
           <w:rFonts w:hint="eastAsia"/>
         </w:rPr>
-        <w:t xml:space="preserve">实时交易执行</w:t>
+        <w:t>實時交易執行</w:t>
       </w:r>
     </w:p>
     <w:p>
@@ -693,7 +693,7 @@
         <w:rPr>
           <w:rFonts w:hint="eastAsia"/>
         </w:rPr>
-        <w:t xml:space="preserve">账户登录与真实投资账户接入</w:t>
+        <w:t>賬戶登入與真實投資賬戶接入</w:t>
       </w:r>
     </w:p>
     <w:p>
@@ -708,7 +708,7 @@
         <w:rPr>
           <w:rFonts w:hint="eastAsia"/>
         </w:rPr>
-        <w:t xml:space="preserve">专业级量化模型与高频分析</w:t>
+        <w:t>專業級量化模型與高頻分析</w:t>
       </w:r>
     </w:p>
     <w:p>
@@ -723,7 +723,7 @@
         <w:rPr>
           <w:rFonts w:hint="eastAsia"/>
         </w:rPr>
-        <w:t xml:space="preserve">财务报表深度基本面建模</w:t>
+        <w:t>財務報表深度基本面建模</w:t>
       </w:r>
     </w:p>
     <w:p>
@@ -738,7 +738,7 @@
         <w:rPr>
           <w:rFonts w:hint="eastAsia"/>
         </w:rPr>
-        <w:t xml:space="preserve">机构级风控和合规模块</w:t>
+        <w:t>機構級風控和合規模組</w:t>
       </w:r>
     </w:p>
     <w:p>
@@ -753,7 +753,7 @@
         <w:rPr>
           <w:rFonts w:hint="eastAsia"/>
         </w:rPr>
-        <w:t xml:space="preserve">个性化财务建议与正式投资建议责任声明支持系统</w:t>
+        <w:t>個性化財務建議與正式投資建議責任宣告支援系統</w:t>
       </w:r>
     </w:p>
     <w:bookmarkEnd w:id="26"/>
@@ -770,7 +770,7 @@
         <w:rPr>
           <w:rFonts w:hint="eastAsia"/>
         </w:rPr>
-        <w:t xml:space="preserve">目标用户</w:t>
+        <w:t>目標使用者</w:t>
       </w:r>
     </w:p>
     <w:bookmarkStart w:id="28" w:name="主要目标用户"/>
@@ -785,7 +785,7 @@
         <w:rPr>
           <w:rFonts w:hint="eastAsia"/>
         </w:rPr>
-        <w:t xml:space="preserve">主要目标用户</w:t>
+        <w:t>主要目標使用者</w:t>
       </w:r>
     </w:p>
     <w:p>
@@ -800,7 +800,7 @@
         <w:rPr>
           <w:rFonts w:hint="eastAsia"/>
         </w:rPr>
-        <w:t xml:space="preserve">希望快速理解自己投资组合风险与收益特征的初级投资者</w:t>
+        <w:t>希望快速理解自己投資組合風險與收益特徵的初級投資者</w:t>
       </w:r>
     </w:p>
     <w:p>
@@ -815,7 +815,7 @@
         <w:rPr>
           <w:rFonts w:hint="eastAsia"/>
         </w:rPr>
-        <w:t xml:space="preserve">需要金融分析产品案例的学生和求职者</w:t>
+        <w:t>需要金融分析產品案例的學生和求職者</w:t>
       </w:r>
     </w:p>
     <w:p>
@@ -830,7 +830,7 @@
         <w:rPr>
           <w:rFonts w:hint="eastAsia"/>
         </w:rPr>
-        <w:t xml:space="preserve">对资产配置分析感兴趣的学习者</w:t>
+        <w:t>對資產配置分析感興趣的學習者</w:t>
       </w:r>
     </w:p>
     <w:bookmarkEnd w:id="28"/>
@@ -846,7 +846,7 @@
         <w:rPr>
           <w:rFonts w:hint="eastAsia"/>
         </w:rPr>
-        <w:t xml:space="preserve">次要目标用户</w:t>
+        <w:t>次要目標使用者</w:t>
       </w:r>
     </w:p>
     <w:p>
@@ -861,7 +861,7 @@
         <w:rPr>
           <w:rFonts w:hint="eastAsia"/>
         </w:rPr>
-        <w:t xml:space="preserve">想展示金融分析能力的数据科学候选人</w:t>
+        <w:t>想展示金融分析能力的資料科學候選人</w:t>
       </w:r>
     </w:p>
     <w:p>
@@ -876,7 +876,7 @@
         <w:rPr>
           <w:rFonts w:hint="eastAsia"/>
         </w:rPr>
-        <w:t xml:space="preserve">对</w:t>
+        <w:t>對</w:t>
       </w:r>
       <w:r>
         <w:t xml:space="preserve"> ETF </w:t>
@@ -885,7 +885,7 @@
         <w:rPr>
           <w:rFonts w:hint="eastAsia"/>
         </w:rPr>
-        <w:t xml:space="preserve">和股票组合比较感兴趣的个人使用者</w:t>
+        <w:t>和股票組合比較感興趣的個人使用者</w:t>
       </w:r>
     </w:p>
     <w:bookmarkEnd w:id="29"/>
@@ -901,7 +901,7 @@
         <w:rPr>
           <w:rFonts w:hint="eastAsia"/>
         </w:rPr>
-        <w:t xml:space="preserve">用户痛点</w:t>
+        <w:t>使用者痛點</w:t>
       </w:r>
     </w:p>
     <w:p>
@@ -916,7 +916,7 @@
         <w:rPr>
           <w:rFonts w:hint="eastAsia"/>
         </w:rPr>
-        <w:t xml:space="preserve">无法快速理解多个资产组成的组合整体表现</w:t>
+        <w:t>無法快速理解多個資產組成的組合整體表現</w:t>
       </w:r>
     </w:p>
     <w:p>
@@ -931,7 +931,7 @@
         <w:rPr>
           <w:rFonts w:hint="eastAsia"/>
         </w:rPr>
-        <w:t xml:space="preserve">难以手动计算波动率、回撤、Sharpe</w:t>
+        <w:t>難以手動計算波動率、回撤、Sharpe</w:t>
       </w:r>
       <w:r>
         <w:t xml:space="preserve"> Ratio </w:t>
@@ -940,7 +940,7 @@
         <w:rPr>
           <w:rFonts w:hint="eastAsia"/>
         </w:rPr>
-        <w:t xml:space="preserve">等指标</w:t>
+        <w:t>等指標</w:t>
       </w:r>
     </w:p>
     <w:p>
@@ -955,7 +955,7 @@
         <w:rPr>
           <w:rFonts w:hint="eastAsia"/>
         </w:rPr>
-        <w:t xml:space="preserve">看得懂数据图表但不一定能解释含义</w:t>
+        <w:t>看得懂資料圖表但不一定能解釋含義</w:t>
       </w:r>
     </w:p>
     <w:p>
@@ -970,7 +970,7 @@
         <w:rPr>
           <w:rFonts w:hint="eastAsia"/>
         </w:rPr>
-        <w:t xml:space="preserve">缺乏一个轻量级且可交互的组合分析工具用于学习与展示</w:t>
+        <w:t>缺乏一個輕量級且可互動的組合分析工具用於學習與展示</w:t>
       </w:r>
     </w:p>
     <w:bookmarkEnd w:id="30"/>
@@ -987,7 +987,7 @@
         <w:rPr>
           <w:rFonts w:hint="eastAsia"/>
         </w:rPr>
-        <w:t xml:space="preserve">问题定义与价值主张</w:t>
+        <w:t>問題定義與價值主張</w:t>
       </w:r>
     </w:p>
     <w:bookmarkStart w:id="32" w:name="问题定义"/>
@@ -1002,7 +1002,7 @@
         <w:rPr>
           <w:rFonts w:hint="eastAsia"/>
         </w:rPr>
-        <w:t xml:space="preserve">问题定义</w:t>
+        <w:t>問題定義</w:t>
       </w:r>
     </w:p>
     <w:p>
@@ -1013,7 +1013,7 @@
         <w:rPr>
           <w:rFonts w:hint="eastAsia"/>
         </w:rPr>
-        <w:t xml:space="preserve">普通用户在构建投资组合后，往往只能看到单个资产的价格变化，而无法快速理解整个组合的风险收益结构，例如：</w:t>
+        <w:t>普通使用者在構建投資組合後，往往只能看到單個資產的價格變化，而無法快速理解整個組合的風險收益結構，例如：</w:t>
       </w:r>
     </w:p>
     <w:p>
@@ -1028,7 +1028,7 @@
         <w:rPr>
           <w:rFonts w:hint="eastAsia"/>
         </w:rPr>
-        <w:t xml:space="preserve">整体回报是否优于</w:t>
+        <w:t>整體回報是否優於</w:t>
       </w:r>
       <w:r>
         <w:t xml:space="preserve"> benchmark</w:t>
@@ -1046,7 +1046,7 @@
         <w:rPr>
           <w:rFonts w:hint="eastAsia"/>
         </w:rPr>
-        <w:t xml:space="preserve">哪些资产拉高了组合波动</w:t>
+        <w:t>哪些資產拉高了組合波動</w:t>
       </w:r>
     </w:p>
     <w:p>
@@ -1061,7 +1061,7 @@
         <w:rPr>
           <w:rFonts w:hint="eastAsia"/>
         </w:rPr>
-        <w:t xml:space="preserve">是否过度集中于某一行业或高相关资产</w:t>
+        <w:t>是否過度集中於某一行業或高相關資產</w:t>
       </w:r>
     </w:p>
     <w:p>
@@ -1076,7 +1076,7 @@
         <w:rPr>
           <w:rFonts w:hint="eastAsia"/>
         </w:rPr>
-        <w:t xml:space="preserve">组合在历史回撤中承受了多大损失</w:t>
+        <w:t>組合在歷史回撤中承受了多大損失</w:t>
       </w:r>
     </w:p>
     <w:bookmarkEnd w:id="32"/>
@@ -1092,7 +1092,7 @@
         <w:rPr>
           <w:rFonts w:hint="eastAsia"/>
         </w:rPr>
-        <w:t xml:space="preserve">价值主张</w:t>
+        <w:t>價值主張</w:t>
       </w:r>
     </w:p>
     <w:p>
@@ -1103,7 +1103,7 @@
         <w:rPr>
           <w:rFonts w:hint="eastAsia"/>
         </w:rPr>
-        <w:t xml:space="preserve">本项目的价值在于：</w:t>
+        <w:t>本專案的價值在於：</w:t>
       </w:r>
     </w:p>
     <w:p>
@@ -1118,7 +1118,7 @@
         <w:rPr>
           <w:rFonts w:hint="eastAsia"/>
         </w:rPr>
-        <w:t xml:space="preserve">将公开市场数据转化为结构化的投资组合洞察</w:t>
+        <w:t>將公開市場資料轉化為結構化的投資組合洞察</w:t>
       </w:r>
     </w:p>
     <w:p>
@@ -1133,7 +1133,7 @@
         <w:rPr>
           <w:rFonts w:hint="eastAsia"/>
         </w:rPr>
-        <w:t xml:space="preserve">通过图表和</w:t>
+        <w:t>透過圖表和</w:t>
       </w:r>
       <w:r>
         <w:t xml:space="preserve"> AI </w:t>
@@ -1142,7 +1142,7 @@
         <w:rPr>
           <w:rFonts w:hint="eastAsia"/>
         </w:rPr>
-        <w:t xml:space="preserve">解释降低分析门槛</w:t>
+        <w:t>解釋降低分析門檻</w:t>
       </w:r>
     </w:p>
     <w:p>
@@ -1157,7 +1157,7 @@
         <w:rPr>
           <w:rFonts w:hint="eastAsia"/>
         </w:rPr>
-        <w:t xml:space="preserve">将金融分析、数据科学和</w:t>
+        <w:t>將金融分析、資料科學和</w:t>
       </w:r>
       <w:r>
         <w:t xml:space="preserve"> AI </w:t>
@@ -1166,7 +1166,7 @@
         <w:rPr>
           <w:rFonts w:hint="eastAsia"/>
         </w:rPr>
-        <w:t xml:space="preserve">应用能力整合为一个可展示作品</w:t>
+        <w:t>應用能力整合為一個可展示作品</w:t>
       </w:r>
     </w:p>
     <w:bookmarkEnd w:id="33"/>
@@ -1183,7 +1183,7 @@
         <w:rPr>
           <w:rFonts w:hint="eastAsia"/>
         </w:rPr>
-        <w:t xml:space="preserve">定义</w:t>
+        <w:t>定義</w:t>
       </w:r>
     </w:p>
     <w:bookmarkStart w:id="35" w:name="mvp-目标"/>
@@ -1198,7 +1198,7 @@
         <w:rPr>
           <w:rFonts w:hint="eastAsia"/>
         </w:rPr>
-        <w:t xml:space="preserve">目标</w:t>
+        <w:t>目標</w:t>
       </w:r>
     </w:p>
     <w:p>
@@ -1209,7 +1209,7 @@
         <w:rPr>
           <w:rFonts w:hint="eastAsia"/>
         </w:rPr>
-        <w:t xml:space="preserve">在最小可行产品阶段，项目应能够完整支持以下流程：</w:t>
+        <w:t>在最小可行產品階段，專案應能夠完整支援以下流程：</w:t>
       </w:r>
     </w:p>
     <w:p>
@@ -1224,7 +1224,7 @@
         <w:rPr>
           <w:rFonts w:hint="eastAsia"/>
         </w:rPr>
-        <w:t xml:space="preserve">用户输入资产代码及权重</w:t>
+        <w:t>使用者輸入資產程式碼及權重</w:t>
       </w:r>
     </w:p>
     <w:p>
@@ -1239,7 +1239,7 @@
         <w:rPr>
           <w:rFonts w:hint="eastAsia"/>
         </w:rPr>
-        <w:t xml:space="preserve">系统获取历史价格数据</w:t>
+        <w:t>系統獲取歷史價格資料</w:t>
       </w:r>
     </w:p>
     <w:p>
@@ -1254,7 +1254,7 @@
         <w:rPr>
           <w:rFonts w:hint="eastAsia"/>
         </w:rPr>
-        <w:t xml:space="preserve">系统计算核心收益与风险指标</w:t>
+        <w:t>系統計算核心收益與風險指標</w:t>
       </w:r>
     </w:p>
     <w:p>
@@ -1269,7 +1269,7 @@
         <w:rPr>
           <w:rFonts w:hint="eastAsia"/>
         </w:rPr>
-        <w:t xml:space="preserve">系统展示关键图表</w:t>
+        <w:t>系統展示關鍵圖表</w:t>
       </w:r>
     </w:p>
     <w:p>
@@ -1284,7 +1284,7 @@
         <w:rPr>
           <w:rFonts w:hint="eastAsia"/>
         </w:rPr>
-        <w:t xml:space="preserve">系统生成简洁的</w:t>
+        <w:t>系統生成簡潔的</w:t>
       </w:r>
       <w:r>
         <w:t xml:space="preserve"> AI </w:t>
@@ -1293,7 +1293,7 @@
         <w:rPr>
           <w:rFonts w:hint="eastAsia"/>
         </w:rPr>
-        <w:t xml:space="preserve">分析报告</w:t>
+        <w:t>分析報告</w:t>
       </w:r>
     </w:p>
     <w:bookmarkEnd w:id="35"/>
@@ -1309,7 +1309,7 @@
         <w:rPr>
           <w:rFonts w:hint="eastAsia"/>
         </w:rPr>
-        <w:t xml:space="preserve">功能模块</w:t>
+        <w:t>功能模組</w:t>
       </w:r>
     </w:p>
     <w:p>
@@ -1322,7 +1322,7 @@
           <w:b/>
           <w:bCs/>
         </w:rPr>
-        <w:t xml:space="preserve">模块一：投资组合输入</w:t>
+        <w:t>模組一：投資組合輸入</w:t>
       </w:r>
     </w:p>
     <w:p>
@@ -1337,7 +1337,7 @@
         <w:rPr>
           <w:rFonts w:hint="eastAsia"/>
         </w:rPr>
-        <w:t xml:space="preserve">支持输入</w:t>
+        <w:t>支援輸入</w:t>
       </w:r>
       <w:r>
         <w:t xml:space="preserve"> 2 </w:t>
@@ -1346,7 +1346,7 @@
         <w:rPr>
           <w:rFonts w:hint="eastAsia"/>
         </w:rPr>
-        <w:t xml:space="preserve">到</w:t>
+        <w:t>到</w:t>
       </w:r>
       <w:r>
         <w:t xml:space="preserve"> 6 </w:t>
@@ -1355,7 +1355,7 @@
         <w:rPr>
           <w:rFonts w:hint="eastAsia"/>
         </w:rPr>
-        <w:t xml:space="preserve">个股票或</w:t>
+        <w:t>個股票或</w:t>
       </w:r>
       <w:r>
         <w:t xml:space="preserve"> ETF ticker</w:t>
@@ -1373,7 +1373,7 @@
         <w:rPr>
           <w:rFonts w:hint="eastAsia"/>
         </w:rPr>
-        <w:t xml:space="preserve">支持输入对应权重</w:t>
+        <w:t>支援輸入對應權重</w:t>
       </w:r>
     </w:p>
     <w:p>
@@ -1388,7 +1388,7 @@
         <w:rPr>
           <w:rFonts w:hint="eastAsia"/>
         </w:rPr>
-        <w:t xml:space="preserve">校验权重总和为</w:t>
+        <w:t>校驗權重總和為</w:t>
       </w:r>
       <w:r>
         <w:t xml:space="preserve"> 100%</w:t>
@@ -1406,7 +1406,7 @@
         <w:rPr>
           <w:rFonts w:hint="eastAsia"/>
         </w:rPr>
-        <w:t xml:space="preserve">允许用户选择分析时间区间</w:t>
+        <w:t>允許使用者選擇分析時間區間</w:t>
       </w:r>
     </w:p>
     <w:p>
@@ -1421,7 +1421,7 @@
         <w:rPr>
           <w:rFonts w:hint="eastAsia"/>
         </w:rPr>
-        <w:t xml:space="preserve">允许用户选择</w:t>
+        <w:t>允許使用者選擇</w:t>
       </w:r>
       <w:r>
         <w:t xml:space="preserve"> benchmark</w:t>
@@ -1437,7 +1437,7 @@
           <w:b/>
           <w:bCs/>
         </w:rPr>
-        <w:t xml:space="preserve">模块二：市场数据获取</w:t>
+        <w:t>模組二：市場資料獲取</w:t>
       </w:r>
     </w:p>
     <w:p>
@@ -1452,7 +1452,7 @@
         <w:rPr>
           <w:rFonts w:hint="eastAsia"/>
         </w:rPr>
-        <w:t xml:space="preserve">获取所选资产的历史收盘价或调整后收盘价</w:t>
+        <w:t>獲取所選資產的歷史收盤價或調整後收盤價</w:t>
       </w:r>
     </w:p>
     <w:p>
@@ -1467,7 +1467,7 @@
         <w:rPr>
           <w:rFonts w:hint="eastAsia"/>
         </w:rPr>
-        <w:t xml:space="preserve">清理缺失值与异常数据</w:t>
+        <w:t>清理缺失值與異常資料</w:t>
       </w:r>
     </w:p>
     <w:p>
@@ -1482,7 +1482,7 @@
         <w:rPr>
           <w:rFonts w:hint="eastAsia"/>
         </w:rPr>
-        <w:t xml:space="preserve">对齐各资产时间序列</w:t>
+        <w:t>對齊各資產時間序列</w:t>
       </w:r>
     </w:p>
     <w:p>
@@ -1495,7 +1495,7 @@
           <w:b/>
           <w:bCs/>
         </w:rPr>
-        <w:t xml:space="preserve">模块三：投资组合分析</w:t>
+        <w:t>模組三：投資組合分析</w:t>
       </w:r>
     </w:p>
     <w:p>
@@ -1510,7 +1510,7 @@
         <w:rPr>
           <w:rFonts w:hint="eastAsia"/>
         </w:rPr>
-        <w:t xml:space="preserve">计算</w:t>
+        <w:t>計算</w:t>
       </w:r>
       <w:r>
         <w:t xml:space="preserve"> individual asset return</w:t>
@@ -1528,7 +1528,7 @@
         <w:rPr>
           <w:rFonts w:hint="eastAsia"/>
         </w:rPr>
-        <w:t xml:space="preserve">计算</w:t>
+        <w:t>計算</w:t>
       </w:r>
       <w:r>
         <w:t xml:space="preserve"> portfolio daily return</w:t>
@@ -1546,7 +1546,7 @@
         <w:rPr>
           <w:rFonts w:hint="eastAsia"/>
         </w:rPr>
-        <w:t xml:space="preserve">计算</w:t>
+        <w:t>計算</w:t>
       </w:r>
       <w:r>
         <w:t xml:space="preserve"> cumulative return</w:t>
@@ -1564,7 +1564,7 @@
         <w:rPr>
           <w:rFonts w:hint="eastAsia"/>
         </w:rPr>
-        <w:t xml:space="preserve">计算</w:t>
+        <w:t>計算</w:t>
       </w:r>
       <w:r>
         <w:t xml:space="preserve"> annualized return</w:t>
@@ -1582,7 +1582,7 @@
         <w:rPr>
           <w:rFonts w:hint="eastAsia"/>
         </w:rPr>
-        <w:t xml:space="preserve">计算</w:t>
+        <w:t>計算</w:t>
       </w:r>
       <w:r>
         <w:t xml:space="preserve"> annualized volatility</w:t>
@@ -1600,7 +1600,7 @@
         <w:rPr>
           <w:rFonts w:hint="eastAsia"/>
         </w:rPr>
-        <w:t xml:space="preserve">计算</w:t>
+        <w:t>計算</w:t>
       </w:r>
       <w:r>
         <w:t xml:space="preserve"> Sharpe Ratio</w:t>
@@ -1618,7 +1618,7 @@
         <w:rPr>
           <w:rFonts w:hint="eastAsia"/>
         </w:rPr>
-        <w:t xml:space="preserve">计算</w:t>
+        <w:t>計算</w:t>
       </w:r>
       <w:r>
         <w:t xml:space="preserve"> Maximum Drawdown</w:t>
@@ -1634,7 +1634,7 @@
           <w:b/>
           <w:bCs/>
         </w:rPr>
-        <w:t xml:space="preserve">模块四：分散化与对比分析</w:t>
+        <w:t>模組四：分散化與對比分析</w:t>
       </w:r>
     </w:p>
     <w:p>
@@ -1649,7 +1649,7 @@
         <w:rPr>
           <w:rFonts w:hint="eastAsia"/>
         </w:rPr>
-        <w:t xml:space="preserve">计算资产间相关系数矩阵</w:t>
+        <w:t>計算資產間相關係數矩陣</w:t>
       </w:r>
     </w:p>
     <w:p>
@@ -1664,7 +1664,7 @@
         <w:rPr>
           <w:rFonts w:hint="eastAsia"/>
         </w:rPr>
-        <w:t xml:space="preserve">识别高相关暴露</w:t>
+        <w:t>識別高相關暴露</w:t>
       </w:r>
     </w:p>
     <w:p>
@@ -1679,7 +1679,7 @@
         <w:rPr>
           <w:rFonts w:hint="eastAsia"/>
         </w:rPr>
-        <w:t xml:space="preserve">生成组合与</w:t>
+        <w:t>生成組合與</w:t>
       </w:r>
       <w:r>
         <w:t xml:space="preserve"> benchmark </w:t>
@@ -1688,7 +1688,7 @@
         <w:rPr>
           <w:rFonts w:hint="eastAsia"/>
         </w:rPr>
-        <w:t xml:space="preserve">对比</w:t>
+        <w:t>對比</w:t>
       </w:r>
     </w:p>
     <w:p>
@@ -1701,7 +1701,7 @@
           <w:b/>
           <w:bCs/>
         </w:rPr>
-        <w:t xml:space="preserve">模块五：可视化输出</w:t>
+        <w:t>模組五：視覺化輸出</w:t>
       </w:r>
     </w:p>
     <w:p>
@@ -1716,7 +1716,7 @@
         <w:rPr>
           <w:rFonts w:hint="eastAsia"/>
         </w:rPr>
-        <w:t xml:space="preserve">组合累计收益折线图</w:t>
+        <w:t>組合累計收益折線圖</w:t>
       </w:r>
     </w:p>
     <w:p>
@@ -1731,7 +1731,7 @@
         <w:rPr>
           <w:rFonts w:hint="eastAsia"/>
         </w:rPr>
-        <w:t xml:space="preserve">组合与</w:t>
+        <w:t>組合與</w:t>
       </w:r>
       <w:r>
         <w:t xml:space="preserve"> benchmark </w:t>
@@ -1740,7 +1740,7 @@
         <w:rPr>
           <w:rFonts w:hint="eastAsia"/>
         </w:rPr>
-        <w:t xml:space="preserve">对比图</w:t>
+        <w:t>對比圖</w:t>
       </w:r>
     </w:p>
     <w:p>
@@ -1755,7 +1755,7 @@
         <w:rPr>
           <w:rFonts w:hint="eastAsia"/>
         </w:rPr>
-        <w:t xml:space="preserve">资产配置饼图</w:t>
+        <w:t>資產配置餅圖</w:t>
       </w:r>
     </w:p>
     <w:p>
@@ -1770,7 +1770,7 @@
         <w:rPr>
           <w:rFonts w:hint="eastAsia"/>
         </w:rPr>
-        <w:t xml:space="preserve">回撤图</w:t>
+        <w:t>回撤圖</w:t>
       </w:r>
     </w:p>
     <w:p>
@@ -1785,7 +1785,7 @@
         <w:rPr>
           <w:rFonts w:hint="eastAsia"/>
         </w:rPr>
-        <w:t xml:space="preserve">相关性热力图</w:t>
+        <w:t>相關性熱力圖</w:t>
       </w:r>
     </w:p>
     <w:p>
@@ -1798,7 +1798,7 @@
           <w:b/>
           <w:bCs/>
         </w:rPr>
-        <w:t xml:space="preserve">模块六：AI</w:t>
+        <w:t>模組六：AI</w:t>
       </w:r>
       <w:r>
         <w:rPr>
@@ -1820,7 +1820,7 @@
         <w:rPr>
           <w:rFonts w:hint="eastAsia"/>
         </w:rPr>
-        <w:t xml:space="preserve">自动生成组合表现总结</w:t>
+        <w:t>自動生成組合表現總結</w:t>
       </w:r>
     </w:p>
     <w:p>
@@ -1835,7 +1835,7 @@
         <w:rPr>
           <w:rFonts w:hint="eastAsia"/>
         </w:rPr>
-        <w:t xml:space="preserve">自动生成风险说明</w:t>
+        <w:t>自動生成風險說明</w:t>
       </w:r>
     </w:p>
     <w:p>
@@ -1850,7 +1850,7 @@
         <w:rPr>
           <w:rFonts w:hint="eastAsia"/>
         </w:rPr>
-        <w:t xml:space="preserve">解释哪些资产可能是主要风险来源</w:t>
+        <w:t>解釋哪些資產可能是主要風險來源</w:t>
       </w:r>
     </w:p>
     <w:p>
@@ -1865,7 +1865,7 @@
         <w:rPr>
           <w:rFonts w:hint="eastAsia"/>
         </w:rPr>
-        <w:t xml:space="preserve">用自然语言说明组合分散化情况</w:t>
+        <w:t>用自然語言說明組合分散化情況</w:t>
       </w:r>
     </w:p>
     <w:bookmarkEnd w:id="36"/>
@@ -1881,7 +1881,7 @@
         <w:rPr>
           <w:rFonts w:hint="eastAsia"/>
         </w:rPr>
-        <w:t xml:space="preserve">成功标准</w:t>
+        <w:t>成功標準</w:t>
       </w:r>
     </w:p>
     <w:p>
@@ -1896,7 +1896,7 @@
         <w:rPr>
           <w:rFonts w:hint="eastAsia"/>
         </w:rPr>
-        <w:t xml:space="preserve">用户可在单次流程中完成输入、分析与查看结果</w:t>
+        <w:t>使用者可在單次流程中完成輸入、分析與檢視結果</w:t>
       </w:r>
     </w:p>
     <w:p>
@@ -1911,7 +1911,7 @@
         <w:rPr>
           <w:rFonts w:hint="eastAsia"/>
         </w:rPr>
-        <w:t xml:space="preserve">页面可稳定展示分析结果和图表</w:t>
+        <w:t>頁面可穩定展示分析結果和圖表</w:t>
       </w:r>
     </w:p>
     <w:p>
@@ -1929,7 +1929,7 @@
         <w:rPr>
           <w:rFonts w:hint="eastAsia"/>
         </w:rPr>
-        <w:t xml:space="preserve">总结能够基于实际指标生成合理解释</w:t>
+        <w:t>總結能夠基於實際指標生成合理解釋</w:t>
       </w:r>
     </w:p>
     <w:p>
@@ -1944,7 +1944,7 @@
         <w:rPr>
           <w:rFonts w:hint="eastAsia"/>
         </w:rPr>
-        <w:t xml:space="preserve">整个产品可在线演示</w:t>
+        <w:t>整個產品可線上演示</w:t>
       </w:r>
     </w:p>
     <w:bookmarkEnd w:id="37"/>
@@ -1961,7 +1961,7 @@
         <w:rPr>
           <w:rFonts w:hint="eastAsia"/>
         </w:rPr>
-        <w:t xml:space="preserve">产品功能清单</w:t>
+        <w:t>產品功能清單</w:t>
       </w:r>
     </w:p>
     <w:bookmarkStart w:id="39" w:name="核心功能"/>
@@ -1976,7 +1976,7 @@
         <w:rPr>
           <w:rFonts w:hint="eastAsia"/>
         </w:rPr>
-        <w:t xml:space="preserve">核心功能</w:t>
+        <w:t>核心功能</w:t>
       </w:r>
     </w:p>
     <w:p>
@@ -1991,7 +1991,7 @@
         <w:rPr>
           <w:rFonts w:hint="eastAsia"/>
         </w:rPr>
-        <w:t xml:space="preserve">投资组合资产输入</w:t>
+        <w:t>投資組合資產輸入</w:t>
       </w:r>
     </w:p>
     <w:p>
@@ -2006,7 +2006,7 @@
         <w:rPr>
           <w:rFonts w:hint="eastAsia"/>
         </w:rPr>
-        <w:t xml:space="preserve">权重校验</w:t>
+        <w:t>權重校驗</w:t>
       </w:r>
     </w:p>
     <w:p>
@@ -2021,7 +2021,7 @@
         <w:rPr>
           <w:rFonts w:hint="eastAsia"/>
         </w:rPr>
-        <w:t xml:space="preserve">历史价格抓取</w:t>
+        <w:t>歷史價格抓取</w:t>
       </w:r>
     </w:p>
     <w:p>
@@ -2036,7 +2036,7 @@
         <w:rPr>
           <w:rFonts w:hint="eastAsia"/>
         </w:rPr>
-        <w:t xml:space="preserve">收益率分析</w:t>
+        <w:t>收益率分析</w:t>
       </w:r>
     </w:p>
     <w:p>
@@ -2051,7 +2051,7 @@
         <w:rPr>
           <w:rFonts w:hint="eastAsia"/>
         </w:rPr>
-        <w:t xml:space="preserve">风险指标分析</w:t>
+        <w:t>風險指標分析</w:t>
       </w:r>
     </w:p>
     <w:p>
@@ -2069,7 +2069,7 @@
         <w:rPr>
           <w:rFonts w:hint="eastAsia"/>
         </w:rPr>
-        <w:t xml:space="preserve">对比</w:t>
+        <w:t>對比</w:t>
       </w:r>
     </w:p>
     <w:p>
@@ -2084,7 +2084,7 @@
         <w:rPr>
           <w:rFonts w:hint="eastAsia"/>
         </w:rPr>
-        <w:t xml:space="preserve">图表展示</w:t>
+        <w:t>圖表展示</w:t>
       </w:r>
     </w:p>
     <w:p>
@@ -2102,7 +2102,7 @@
         <w:rPr>
           <w:rFonts w:hint="eastAsia"/>
         </w:rPr>
-        <w:t xml:space="preserve">洞察生成</w:t>
+        <w:t>洞察生成</w:t>
       </w:r>
     </w:p>
     <w:bookmarkEnd w:id="39"/>
@@ -2118,7 +2118,7 @@
         <w:rPr>
           <w:rFonts w:hint="eastAsia"/>
         </w:rPr>
-        <w:t xml:space="preserve">进阶功能</w:t>
+        <w:t>進階功能</w:t>
       </w:r>
     </w:p>
     <w:p>
@@ -2130,7 +2130,7 @@
         </w:numPr>
       </w:pPr>
       <w:r>
-        <w:t xml:space="preserve">Portfolio Optimization</w:t>
+        <w:t>Portfolio Optimization</w:t>
       </w:r>
     </w:p>
     <w:p>
@@ -2142,7 +2142,7 @@
         </w:numPr>
       </w:pPr>
       <w:r>
-        <w:t xml:space="preserve">Monte Carlo Simulation</w:t>
+        <w:t>Monte Carlo Simulation</w:t>
       </w:r>
     </w:p>
     <w:p>
@@ -2157,7 +2157,7 @@
         <w:rPr>
           <w:rFonts w:hint="eastAsia"/>
         </w:rPr>
-        <w:t xml:space="preserve">情景分析（Scenario</w:t>
+        <w:t>情景分析（Scenario</w:t>
       </w:r>
       <w:r>
         <w:t xml:space="preserve"> </w:t>
@@ -2166,7 +2166,7 @@
         <w:rPr>
           <w:rFonts w:hint="eastAsia"/>
         </w:rPr>
-        <w:t xml:space="preserve">Analysis）</w:t>
+        <w:t>Analysis）</w:t>
       </w:r>
     </w:p>
     <w:p>
@@ -2181,7 +2181,7 @@
         <w:rPr>
           <w:rFonts w:hint="eastAsia"/>
         </w:rPr>
-        <w:t xml:space="preserve">风险贡献度分析（Risk</w:t>
+        <w:t>風險貢獻度分析（Risk</w:t>
       </w:r>
       <w:r>
         <w:t xml:space="preserve"> Contribution by </w:t>
@@ -2190,7 +2190,7 @@
         <w:rPr>
           <w:rFonts w:hint="eastAsia"/>
         </w:rPr>
-        <w:t xml:space="preserve">Asset）</w:t>
+        <w:t>Asset）</w:t>
       </w:r>
     </w:p>
     <w:p>
@@ -2208,7 +2208,7 @@
         <w:rPr>
           <w:rFonts w:hint="eastAsia"/>
         </w:rPr>
-        <w:t xml:space="preserve">问答模块</w:t>
+        <w:t>問答模組</w:t>
       </w:r>
     </w:p>
     <w:p>
@@ -2226,7 +2226,7 @@
         <w:rPr>
           <w:rFonts w:hint="eastAsia"/>
         </w:rPr>
-        <w:t xml:space="preserve">报告导出</w:t>
+        <w:t>報告匯出</w:t>
       </w:r>
     </w:p>
     <w:p>
@@ -2241,7 +2241,7 @@
         <w:rPr>
           <w:rFonts w:hint="eastAsia"/>
         </w:rPr>
-        <w:t xml:space="preserve">用户保存分析记录</w:t>
+        <w:t>使用者儲存分析記錄</w:t>
       </w:r>
     </w:p>
     <w:bookmarkEnd w:id="40"/>
@@ -2257,7 +2257,7 @@
         <w:rPr>
           <w:rFonts w:hint="eastAsia"/>
         </w:rPr>
-        <w:t xml:space="preserve">非功能性需求</w:t>
+        <w:t>非功能性需求</w:t>
       </w:r>
     </w:p>
     <w:p>
@@ -2272,7 +2272,7 @@
         <w:rPr>
           <w:rFonts w:hint="eastAsia"/>
         </w:rPr>
-        <w:t xml:space="preserve">页面响应速度合理，单次分析等待时间控制在可接受范围</w:t>
+        <w:t>頁面響應速度合理，單次分析等待時間控制在可接受範圍</w:t>
       </w:r>
     </w:p>
     <w:p>
@@ -2287,7 +2287,7 @@
         <w:rPr>
           <w:rFonts w:hint="eastAsia"/>
         </w:rPr>
-        <w:t xml:space="preserve">界面在桌面端优先优化，同时兼顾移动端查看</w:t>
+        <w:t>介面在桌面端優先最佳化，同時兼顧移動端檢視</w:t>
       </w:r>
     </w:p>
     <w:p>
@@ -2302,7 +2302,7 @@
         <w:rPr>
           <w:rFonts w:hint="eastAsia"/>
         </w:rPr>
-        <w:t xml:space="preserve">图表清晰、专业、信息层次明确</w:t>
+        <w:t>圖表清晰、專業、資訊層次明確</w:t>
       </w:r>
     </w:p>
     <w:p>
@@ -2317,7 +2317,7 @@
         <w:rPr>
           <w:rFonts w:hint="eastAsia"/>
         </w:rPr>
-        <w:t xml:space="preserve">输入错误时有友好提示</w:t>
+        <w:t>輸入錯誤時有友好提示</w:t>
       </w:r>
     </w:p>
     <w:p>
@@ -2335,7 +2335,7 @@
         <w:rPr>
           <w:rFonts w:hint="eastAsia"/>
         </w:rPr>
-        <w:t xml:space="preserve">输出避免夸大，定位为解释和支持，不作为正式投资建议</w:t>
+        <w:t>輸出避免誇大，定位為解釋和支援，不作為正式投資建議</w:t>
       </w:r>
     </w:p>
     <w:bookmarkEnd w:id="41"/>
@@ -2352,7 +2352,7 @@
         <w:rPr>
           <w:rFonts w:hint="eastAsia"/>
         </w:rPr>
-        <w:t xml:space="preserve">用户流程</w:t>
+        <w:t>使用者流程</w:t>
       </w:r>
     </w:p>
     <w:bookmarkStart w:id="43" w:name="主流程"/>
@@ -2367,7 +2367,7 @@
         <w:rPr>
           <w:rFonts w:hint="eastAsia"/>
         </w:rPr>
-        <w:t xml:space="preserve">主流程</w:t>
+        <w:t>主流程</w:t>
       </w:r>
     </w:p>
     <w:p>
@@ -2382,7 +2382,7 @@
         <w:rPr>
           <w:rFonts w:hint="eastAsia"/>
         </w:rPr>
-        <w:t xml:space="preserve">用户进入首页</w:t>
+        <w:t>使用者進入首頁</w:t>
       </w:r>
     </w:p>
     <w:p>
@@ -2397,7 +2397,7 @@
         <w:rPr>
           <w:rFonts w:hint="eastAsia"/>
         </w:rPr>
-        <w:t xml:space="preserve">点击开始分析</w:t>
+        <w:t>點選開始分析</w:t>
       </w:r>
     </w:p>
     <w:p>
@@ -2412,7 +2412,7 @@
         <w:rPr>
           <w:rFonts w:hint="eastAsia"/>
         </w:rPr>
-        <w:t xml:space="preserve">输入</w:t>
+        <w:t>輸入</w:t>
       </w:r>
       <w:r>
         <w:t xml:space="preserve"> </w:t>
@@ -2421,7 +2421,7 @@
         <w:rPr>
           <w:rFonts w:hint="eastAsia"/>
         </w:rPr>
-        <w:t xml:space="preserve">ticker、权重、时间范围和</w:t>
+        <w:t>ticker、權重、時間範圍和</w:t>
       </w:r>
       <w:r>
         <w:t xml:space="preserve"> benchmark</w:t>
@@ -2439,7 +2439,7 @@
         <w:rPr>
           <w:rFonts w:hint="eastAsia"/>
         </w:rPr>
-        <w:t xml:space="preserve">提交分析请求</w:t>
+        <w:t>提交分析請求</w:t>
       </w:r>
     </w:p>
     <w:p>
@@ -2454,7 +2454,7 @@
         <w:rPr>
           <w:rFonts w:hint="eastAsia"/>
         </w:rPr>
-        <w:t xml:space="preserve">系统拉取数据并完成指标计算</w:t>
+        <w:t>系統拉取資料並完成指標計算</w:t>
       </w:r>
     </w:p>
     <w:p>
@@ -2469,7 +2469,7 @@
         <w:rPr>
           <w:rFonts w:hint="eastAsia"/>
         </w:rPr>
-        <w:t xml:space="preserve">页面展示</w:t>
+        <w:t>頁面展示</w:t>
       </w:r>
       <w:r>
         <w:t xml:space="preserve"> dashboard </w:t>
@@ -2478,7 +2478,7 @@
         <w:rPr>
           <w:rFonts w:hint="eastAsia"/>
         </w:rPr>
-        <w:t xml:space="preserve">分析结果</w:t>
+        <w:t>分析結果</w:t>
       </w:r>
     </w:p>
     <w:p>
@@ -2493,7 +2493,7 @@
         <w:rPr>
           <w:rFonts w:hint="eastAsia"/>
         </w:rPr>
-        <w:t xml:space="preserve">系统生成</w:t>
+        <w:t>系統生成</w:t>
       </w:r>
       <w:r>
         <w:t xml:space="preserve"> AI Summary</w:t>
@@ -2511,7 +2511,7 @@
         <w:rPr>
           <w:rFonts w:hint="eastAsia"/>
         </w:rPr>
-        <w:t xml:space="preserve">用户阅读结果并进行二次调整</w:t>
+        <w:t>使用者閱讀結果並進行二次調整</w:t>
       </w:r>
     </w:p>
     <w:bookmarkEnd w:id="43"/>
@@ -2527,7 +2527,7 @@
         <w:rPr>
           <w:rFonts w:hint="eastAsia"/>
         </w:rPr>
-        <w:t xml:space="preserve">异常流程</w:t>
+        <w:t>異常流程</w:t>
       </w:r>
     </w:p>
     <w:p>
@@ -2545,7 +2545,7 @@
         <w:rPr>
           <w:rFonts w:hint="eastAsia"/>
         </w:rPr>
-        <w:t xml:space="preserve">输入错误时提示重新输入</w:t>
+        <w:t>輸入錯誤時提示重新輸入</w:t>
       </w:r>
     </w:p>
     <w:p>
@@ -2560,7 +2560,7 @@
         <w:rPr>
           <w:rFonts w:hint="eastAsia"/>
         </w:rPr>
-        <w:t xml:space="preserve">权重总和不等于</w:t>
+        <w:t>權重總和不等於</w:t>
       </w:r>
       <w:r>
         <w:t xml:space="preserve"> 100% </w:t>
@@ -2569,7 +2569,7 @@
         <w:rPr>
           <w:rFonts w:hint="eastAsia"/>
         </w:rPr>
-        <w:t xml:space="preserve">时阻止提交</w:t>
+        <w:t>時阻止提交</w:t>
       </w:r>
     </w:p>
     <w:p>
@@ -2584,7 +2584,7 @@
         <w:rPr>
           <w:rFonts w:hint="eastAsia"/>
         </w:rPr>
-        <w:t xml:space="preserve">数据接口返回为空时提示用户更换资产或时间范围</w:t>
+        <w:t>資料介面返回為空時提示使用者更換資產或時間範圍</w:t>
       </w:r>
     </w:p>
     <w:p>
@@ -2602,7 +2602,7 @@
         <w:rPr>
           <w:rFonts w:hint="eastAsia"/>
         </w:rPr>
-        <w:t xml:space="preserve">服务不可用时仍保留指标与图表结果</w:t>
+        <w:t>服務不可用時仍保留指標與圖表結果</w:t>
       </w:r>
     </w:p>
     <w:bookmarkEnd w:id="44"/>
@@ -2619,7 +2619,7 @@
         <w:rPr>
           <w:rFonts w:hint="eastAsia"/>
         </w:rPr>
-        <w:t xml:space="preserve">页面设计与信息架构</w:t>
+        <w:t>頁面設計與資訊架構</w:t>
       </w:r>
     </w:p>
     <w:bookmarkStart w:id="46" w:name="页面结构"/>
@@ -2634,7 +2634,7 @@
         <w:rPr>
           <w:rFonts w:hint="eastAsia"/>
         </w:rPr>
-        <w:t xml:space="preserve">页面结构</w:t>
+        <w:t>頁面結構</w:t>
       </w:r>
     </w:p>
     <w:p>
@@ -2647,7 +2647,7 @@
           <w:b/>
           <w:bCs/>
         </w:rPr>
-        <w:t xml:space="preserve">首页</w:t>
+        <w:t>首頁</w:t>
       </w:r>
     </w:p>
     <w:p>
@@ -2662,7 +2662,7 @@
         <w:rPr>
           <w:rFonts w:hint="eastAsia"/>
         </w:rPr>
-        <w:t xml:space="preserve">项目介绍</w:t>
+        <w:t>專案介紹</w:t>
       </w:r>
     </w:p>
     <w:p>
@@ -2677,7 +2677,7 @@
         <w:rPr>
           <w:rFonts w:hint="eastAsia"/>
         </w:rPr>
-        <w:t xml:space="preserve">核心卖点</w:t>
+        <w:t>核心賣點</w:t>
       </w:r>
     </w:p>
     <w:p>
@@ -2692,7 +2692,7 @@
         <w:rPr>
           <w:rFonts w:hint="eastAsia"/>
         </w:rPr>
-        <w:t xml:space="preserve">开始分析入口</w:t>
+        <w:t>開始分析入口</w:t>
       </w:r>
     </w:p>
     <w:p>
@@ -2705,7 +2705,7 @@
           <w:b/>
           <w:bCs/>
         </w:rPr>
-        <w:t xml:space="preserve">输入页</w:t>
+        <w:t>輸入頁</w:t>
       </w:r>
     </w:p>
     <w:p>
@@ -2723,7 +2723,7 @@
         <w:rPr>
           <w:rFonts w:hint="eastAsia"/>
         </w:rPr>
-        <w:t xml:space="preserve">输入区</w:t>
+        <w:t>輸入區</w:t>
       </w:r>
     </w:p>
     <w:p>
@@ -2738,7 +2738,7 @@
         <w:rPr>
           <w:rFonts w:hint="eastAsia"/>
         </w:rPr>
-        <w:t xml:space="preserve">权重设置区</w:t>
+        <w:t>權重設定區</w:t>
       </w:r>
     </w:p>
     <w:p>
@@ -2753,7 +2753,7 @@
         <w:rPr>
           <w:rFonts w:hint="eastAsia"/>
         </w:rPr>
-        <w:t xml:space="preserve">时间区间选择</w:t>
+        <w:t>時間區間選擇</w:t>
       </w:r>
     </w:p>
     <w:p>
@@ -2771,7 +2771,7 @@
         <w:rPr>
           <w:rFonts w:hint="eastAsia"/>
         </w:rPr>
-        <w:t xml:space="preserve">选择</w:t>
+        <w:t>選擇</w:t>
       </w:r>
     </w:p>
     <w:p>
@@ -2786,7 +2786,7 @@
         <w:rPr>
           <w:rFonts w:hint="eastAsia"/>
         </w:rPr>
-        <w:t xml:space="preserve">提交按钮</w:t>
+        <w:t>提交按鈕</w:t>
       </w:r>
     </w:p>
     <w:p>
@@ -2799,7 +2799,7 @@
           <w:b/>
           <w:bCs/>
         </w:rPr>
-        <w:t xml:space="preserve">结果页</w:t>
+        <w:t>結果頁</w:t>
       </w:r>
     </w:p>
     <w:p>
@@ -2817,7 +2817,7 @@
         <w:rPr>
           <w:rFonts w:hint="eastAsia"/>
         </w:rPr>
-        <w:t xml:space="preserve">指标卡片区</w:t>
+        <w:t>指標卡片區</w:t>
       </w:r>
     </w:p>
     <w:p>
@@ -2832,7 +2832,7 @@
         <w:rPr>
           <w:rFonts w:hint="eastAsia"/>
         </w:rPr>
-        <w:t xml:space="preserve">累计收益折线图</w:t>
+        <w:t>累計收益折線圖</w:t>
       </w:r>
     </w:p>
     <w:p>
@@ -2850,7 +2850,7 @@
         <w:rPr>
           <w:rFonts w:hint="eastAsia"/>
         </w:rPr>
-        <w:t xml:space="preserve">对比图</w:t>
+        <w:t>對比圖</w:t>
       </w:r>
     </w:p>
     <w:p>
@@ -2865,7 +2865,7 @@
         <w:rPr>
           <w:rFonts w:hint="eastAsia"/>
         </w:rPr>
-        <w:t xml:space="preserve">回撤图</w:t>
+        <w:t>回撤圖</w:t>
       </w:r>
     </w:p>
     <w:p>
@@ -2880,7 +2880,7 @@
         <w:rPr>
           <w:rFonts w:hint="eastAsia"/>
         </w:rPr>
-        <w:t xml:space="preserve">资产配置图</w:t>
+        <w:t>資產配置圖</w:t>
       </w:r>
     </w:p>
     <w:p>
@@ -2895,7 +2895,7 @@
         <w:rPr>
           <w:rFonts w:hint="eastAsia"/>
         </w:rPr>
-        <w:t xml:space="preserve">相关性热力图</w:t>
+        <w:t>相關性熱力圖</w:t>
       </w:r>
     </w:p>
     <w:p>
@@ -2913,7 +2913,7 @@
         <w:rPr>
           <w:rFonts w:hint="eastAsia"/>
         </w:rPr>
-        <w:t xml:space="preserve">模块</w:t>
+        <w:t>模組</w:t>
       </w:r>
     </w:p>
     <w:bookmarkEnd w:id="46"/>
@@ -2929,7 +2929,7 @@
         <w:rPr>
           <w:rFonts w:hint="eastAsia"/>
         </w:rPr>
-        <w:t xml:space="preserve">信息设计原则</w:t>
+        <w:t>資訊設計原則</w:t>
       </w:r>
     </w:p>
     <w:p>
@@ -2944,7 +2944,7 @@
         <w:rPr>
           <w:rFonts w:hint="eastAsia"/>
         </w:rPr>
-        <w:t xml:space="preserve">优先突出对用户最重要的结果：收益、风险、回撤、分散化</w:t>
+        <w:t>優先突出對使用者最重要的結果：收益、風險、回撤、分散化</w:t>
       </w:r>
     </w:p>
     <w:p>
@@ -2959,7 +2959,7 @@
         <w:rPr>
           <w:rFonts w:hint="eastAsia"/>
         </w:rPr>
-        <w:t xml:space="preserve">图表在视觉上要有主次层级</w:t>
+        <w:t>圖表在視覺上要有主次層級</w:t>
       </w:r>
     </w:p>
     <w:p>
@@ -2974,7 +2974,7 @@
         <w:rPr>
           <w:rFonts w:hint="eastAsia"/>
         </w:rPr>
-        <w:t xml:space="preserve">文字解释与图表紧密配合</w:t>
+        <w:t>文字解釋與圖表緊密配合</w:t>
       </w:r>
     </w:p>
     <w:p>
@@ -2989,7 +2989,7 @@
         <w:rPr>
           <w:rFonts w:hint="eastAsia"/>
         </w:rPr>
-        <w:t xml:space="preserve">避免页面一次性堆叠过多金融术语</w:t>
+        <w:t>避免頁面一次性堆疊過多金融術語</w:t>
       </w:r>
     </w:p>
     <w:bookmarkEnd w:id="47"/>
@@ -3006,7 +3006,7 @@
         <w:rPr>
           <w:rFonts w:hint="eastAsia"/>
         </w:rPr>
-        <w:t xml:space="preserve">技术方案与</w:t>
+        <w:t>技術方案與</w:t>
       </w:r>
       <w:r>
         <w:t xml:space="preserve"> Tech Stack</w:t>
@@ -3024,7 +3024,7 @@
         <w:rPr>
           <w:rFonts w:hint="eastAsia"/>
         </w:rPr>
-        <w:t xml:space="preserve">前端技术</w:t>
+        <w:t>前端技術</w:t>
       </w:r>
     </w:p>
     <w:p>
@@ -3036,7 +3036,7 @@
         </w:numPr>
       </w:pPr>
       <w:r>
-        <w:t xml:space="preserve">React</w:t>
+        <w:t>React</w:t>
       </w:r>
     </w:p>
     <w:p>
@@ -3048,7 +3048,7 @@
         </w:numPr>
       </w:pPr>
       <w:r>
-        <w:t xml:space="preserve">Vite</w:t>
+        <w:t>Vite</w:t>
       </w:r>
     </w:p>
     <w:p>
@@ -3060,7 +3060,7 @@
         </w:numPr>
       </w:pPr>
       <w:r>
-        <w:t xml:space="preserve">Tailwind CSS</w:t>
+        <w:t>Tailwind CSS</w:t>
       </w:r>
     </w:p>
     <w:p>
@@ -3078,7 +3078,7 @@
         <w:rPr>
           <w:rFonts w:hint="eastAsia"/>
         </w:rPr>
-        <w:t xml:space="preserve">或</w:t>
+        <w:t>或</w:t>
       </w:r>
       <w:r>
         <w:t xml:space="preserve"> Plotly</w:t>
@@ -3094,7 +3094,7 @@
           <w:b/>
           <w:bCs/>
         </w:rPr>
-        <w:t xml:space="preserve">原因</w:t>
+        <w:t>原因</w:t>
       </w:r>
     </w:p>
     <w:p>
@@ -3112,7 +3112,7 @@
         <w:rPr>
           <w:rFonts w:hint="eastAsia"/>
         </w:rPr>
-        <w:t xml:space="preserve">开发效率高，适合快速构建</w:t>
+        <w:t>開發效率高，適合快速構建</w:t>
       </w:r>
       <w:r>
         <w:t xml:space="preserve"> dashboard</w:t>
@@ -3133,7 +3133,7 @@
         <w:rPr>
           <w:rFonts w:hint="eastAsia"/>
         </w:rPr>
-        <w:t xml:space="preserve">有助于快速搭建现代化界面</w:t>
+        <w:t>有助於快速搭建現代化介面</w:t>
       </w:r>
     </w:p>
     <w:p>
@@ -3151,7 +3151,7 @@
         <w:rPr>
           <w:rFonts w:hint="eastAsia"/>
         </w:rPr>
-        <w:t xml:space="preserve">或</w:t>
+        <w:t>或</w:t>
       </w:r>
       <w:r>
         <w:t xml:space="preserve"> Plotly </w:t>
@@ -3160,7 +3160,7 @@
         <w:rPr>
           <w:rFonts w:hint="eastAsia"/>
         </w:rPr>
-        <w:t xml:space="preserve">适合构建金融分析图表</w:t>
+        <w:t>適合構建金融分析圖表</w:t>
       </w:r>
     </w:p>
     <w:bookmarkEnd w:id="49"/>
@@ -3176,7 +3176,7 @@
         <w:rPr>
           <w:rFonts w:hint="eastAsia"/>
         </w:rPr>
-        <w:t xml:space="preserve">后端技术</w:t>
+        <w:t>後端技術</w:t>
       </w:r>
     </w:p>
     <w:p>
@@ -3188,7 +3188,7 @@
         </w:numPr>
       </w:pPr>
       <w:r>
-        <w:t xml:space="preserve">Python</w:t>
+        <w:t>Python</w:t>
       </w:r>
     </w:p>
     <w:p>
@@ -3200,7 +3200,7 @@
         </w:numPr>
       </w:pPr>
       <w:r>
-        <w:t xml:space="preserve">FastAPI</w:t>
+        <w:t>FastAPI</w:t>
       </w:r>
     </w:p>
     <w:p>
@@ -3213,7 +3213,7 @@
           <w:b/>
           <w:bCs/>
         </w:rPr>
-        <w:t xml:space="preserve">原因</w:t>
+        <w:t>原因</w:t>
       </w:r>
     </w:p>
     <w:p>
@@ -3231,7 +3231,7 @@
         <w:rPr>
           <w:rFonts w:hint="eastAsia"/>
         </w:rPr>
-        <w:t xml:space="preserve">适合数据分析与金融计算</w:t>
+        <w:t>適合資料分析與金融計算</w:t>
       </w:r>
     </w:p>
     <w:p>
@@ -3249,7 +3249,7 @@
         <w:rPr>
           <w:rFonts w:hint="eastAsia"/>
         </w:rPr>
-        <w:t xml:space="preserve">易于开发</w:t>
+        <w:t>易於開發</w:t>
       </w:r>
       <w:r>
         <w:t xml:space="preserve"> </w:t>
@@ -3258,7 +3258,7 @@
         <w:rPr>
           <w:rFonts w:hint="eastAsia"/>
         </w:rPr>
-        <w:t xml:space="preserve">API，结构清晰、性能较好</w:t>
+        <w:t>API，結構清晰、效能較好</w:t>
       </w:r>
     </w:p>
     <w:bookmarkEnd w:id="50"/>
@@ -3274,7 +3274,7 @@
         <w:rPr>
           <w:rFonts w:hint="eastAsia"/>
         </w:rPr>
-        <w:t xml:space="preserve">数据分析库</w:t>
+        <w:t>資料分析庫</w:t>
       </w:r>
     </w:p>
     <w:p>
@@ -3286,7 +3286,7 @@
         </w:numPr>
       </w:pPr>
       <w:r>
-        <w:t xml:space="preserve">pandas</w:t>
+        <w:t>pandas</w:t>
       </w:r>
     </w:p>
     <w:p>
@@ -3298,7 +3298,7 @@
         </w:numPr>
       </w:pPr>
       <w:r>
-        <w:t xml:space="preserve">numpy</w:t>
+        <w:t>numpy</w:t>
       </w:r>
     </w:p>
     <w:p>
@@ -3310,7 +3310,7 @@
         </w:numPr>
       </w:pPr>
       <w:r>
-        <w:t xml:space="preserve">scipy</w:t>
+        <w:t>scipy</w:t>
       </w:r>
     </w:p>
     <w:bookmarkEnd w:id="51"/>
@@ -3326,7 +3326,7 @@
         <w:rPr>
           <w:rFonts w:hint="eastAsia"/>
         </w:rPr>
-        <w:t xml:space="preserve">金融数据来源</w:t>
+        <w:t>金融資料來源</w:t>
       </w:r>
     </w:p>
     <w:p>
@@ -3338,7 +3338,7 @@
         </w:numPr>
       </w:pPr>
       <w:r>
-        <w:t xml:space="preserve">yfinance</w:t>
+        <w:t>yfinance</w:t>
       </w:r>
     </w:p>
     <w:p>
@@ -3351,7 +3351,7 @@
           <w:b/>
           <w:bCs/>
         </w:rPr>
-        <w:t xml:space="preserve">原因</w:t>
+        <w:t>原因</w:t>
       </w:r>
     </w:p>
     <w:p>
@@ -3366,7 +3366,7 @@
         <w:rPr>
           <w:rFonts w:hint="eastAsia"/>
         </w:rPr>
-        <w:t xml:space="preserve">获取股票</w:t>
+        <w:t>獲取股票</w:t>
       </w:r>
       <w:r>
         <w:t xml:space="preserve"> / ETF </w:t>
@@ -3375,7 +3375,7 @@
         <w:rPr>
           <w:rFonts w:hint="eastAsia"/>
         </w:rPr>
-        <w:t xml:space="preserve">历史价格便捷</w:t>
+        <w:t>歷史價格便捷</w:t>
       </w:r>
     </w:p>
     <w:p>
@@ -3390,7 +3390,7 @@
         <w:rPr>
           <w:rFonts w:hint="eastAsia"/>
         </w:rPr>
-        <w:t xml:space="preserve">适合学生项目和公开演示</w:t>
+        <w:t>適合學生專案和公開演示</w:t>
       </w:r>
     </w:p>
     <w:p>
@@ -3405,7 +3405,7 @@
         <w:rPr>
           <w:rFonts w:hint="eastAsia"/>
         </w:rPr>
-        <w:t xml:space="preserve">数据足够支持收益、波动率和回撤分析</w:t>
+        <w:t>資料足夠支援收益、波動率和回撤分析</w:t>
       </w:r>
     </w:p>
     <w:bookmarkEnd w:id="52"/>
@@ -3421,7 +3421,7 @@
         <w:rPr>
           <w:rFonts w:hint="eastAsia"/>
         </w:rPr>
-        <w:t xml:space="preserve">能力支持</w:t>
+        <w:t>能力支援</w:t>
       </w:r>
     </w:p>
     <w:p>
@@ -3439,7 +3439,7 @@
         <w:rPr>
           <w:rFonts w:hint="eastAsia"/>
         </w:rPr>
-        <w:t xml:space="preserve">或其他</w:t>
+        <w:t>或其他</w:t>
       </w:r>
       <w:r>
         <w:t xml:space="preserve"> LLM API</w:t>
@@ -3462,7 +3462,7 @@
           <w:b/>
           <w:bCs/>
         </w:rPr>
-        <w:t xml:space="preserve">使用方式</w:t>
+        <w:t>使用方式</w:t>
       </w:r>
     </w:p>
     <w:p>
@@ -3477,7 +3477,7 @@
         <w:rPr>
           <w:rFonts w:hint="eastAsia"/>
         </w:rPr>
-        <w:t xml:space="preserve">对分析结果生成自然语言总结</w:t>
+        <w:t>對分析結果生成自然語言總結</w:t>
       </w:r>
     </w:p>
     <w:p>
@@ -3492,7 +3492,7 @@
         <w:rPr>
           <w:rFonts w:hint="eastAsia"/>
         </w:rPr>
-        <w:t xml:space="preserve">解释风险指标含义</w:t>
+        <w:t>解釋風險指標含義</w:t>
       </w:r>
     </w:p>
     <w:p>
@@ -3507,7 +3507,7 @@
         <w:rPr>
           <w:rFonts w:hint="eastAsia"/>
         </w:rPr>
-        <w:t xml:space="preserve">提供组合特征说明与改进方向建议</w:t>
+        <w:t>提供組合特徵說明與改進方向建議</w:t>
       </w:r>
     </w:p>
     <w:bookmarkEnd w:id="53"/>
@@ -3523,7 +3523,7 @@
         <w:rPr>
           <w:rFonts w:hint="eastAsia"/>
         </w:rPr>
-        <w:t xml:space="preserve">部署方案</w:t>
+        <w:t>部署方案</w:t>
       </w:r>
     </w:p>
     <w:p>
@@ -3538,7 +3538,7 @@
         <w:rPr>
           <w:rFonts w:hint="eastAsia"/>
         </w:rPr>
-        <w:t xml:space="preserve">前端：Vercel</w:t>
+        <w:t>前端：Vercel</w:t>
       </w:r>
     </w:p>
     <w:p>
@@ -3553,7 +3553,7 @@
         <w:rPr>
           <w:rFonts w:hint="eastAsia"/>
         </w:rPr>
-        <w:t xml:space="preserve">后端：Render</w:t>
+        <w:t>後端：Render</w:t>
       </w:r>
       <w:r>
         <w:t xml:space="preserve"> </w:t>
@@ -3562,7 +3562,7 @@
         <w:rPr>
           <w:rFonts w:hint="eastAsia"/>
         </w:rPr>
-        <w:t xml:space="preserve">或</w:t>
+        <w:t>或</w:t>
       </w:r>
       <w:r>
         <w:t xml:space="preserve"> Railway</w:t>
@@ -3582,7 +3582,7 @@
         <w:rPr>
           <w:rFonts w:hint="eastAsia"/>
         </w:rPr>
-        <w:t xml:space="preserve">数据方案</w:t>
+        <w:t>資料方案</w:t>
       </w:r>
     </w:p>
     <w:bookmarkStart w:id="56" w:name="数据类型"/>
@@ -3597,7 +3597,7 @@
         <w:rPr>
           <w:rFonts w:hint="eastAsia"/>
         </w:rPr>
-        <w:t xml:space="preserve">数据类型</w:t>
+        <w:t>資料型別</w:t>
       </w:r>
     </w:p>
     <w:p>
@@ -3612,7 +3612,7 @@
         <w:rPr>
           <w:rFonts w:hint="eastAsia"/>
         </w:rPr>
-        <w:t xml:space="preserve">股票或</w:t>
+        <w:t>股票或</w:t>
       </w:r>
       <w:r>
         <w:t xml:space="preserve"> ETF </w:t>
@@ -3621,7 +3621,7 @@
         <w:rPr>
           <w:rFonts w:hint="eastAsia"/>
         </w:rPr>
-        <w:t xml:space="preserve">历史价格数据</w:t>
+        <w:t>歷史價格資料</w:t>
       </w:r>
     </w:p>
     <w:p>
@@ -3639,7 +3639,7 @@
         <w:rPr>
           <w:rFonts w:hint="eastAsia"/>
         </w:rPr>
-        <w:t xml:space="preserve">历史价格数据</w:t>
+        <w:t>歷史價格資料</w:t>
       </w:r>
     </w:p>
     <w:p>
@@ -3654,7 +3654,7 @@
         <w:rPr>
           <w:rFonts w:hint="eastAsia"/>
         </w:rPr>
-        <w:t xml:space="preserve">用户输入的权重数据</w:t>
+        <w:t>使用者輸入的權重資料</w:t>
       </w:r>
     </w:p>
     <w:bookmarkEnd w:id="56"/>
@@ -3670,7 +3670,7 @@
         <w:rPr>
           <w:rFonts w:hint="eastAsia"/>
         </w:rPr>
-        <w:t xml:space="preserve">数据处理流程</w:t>
+        <w:t>資料處理流程</w:t>
       </w:r>
     </w:p>
     <w:p>
@@ -3685,7 +3685,7 @@
         <w:rPr>
           <w:rFonts w:hint="eastAsia"/>
         </w:rPr>
-        <w:t xml:space="preserve">接收</w:t>
+        <w:t>接收</w:t>
       </w:r>
       <w:r>
         <w:t xml:space="preserve"> ticker </w:t>
@@ -3694,7 +3694,7 @@
         <w:rPr>
           <w:rFonts w:hint="eastAsia"/>
         </w:rPr>
-        <w:t xml:space="preserve">列表</w:t>
+        <w:t>列表</w:t>
       </w:r>
     </w:p>
     <w:p>
@@ -3709,7 +3709,7 @@
         <w:rPr>
           <w:rFonts w:hint="eastAsia"/>
         </w:rPr>
-        <w:t xml:space="preserve">请求历史价格数据</w:t>
+        <w:t>請求歷史價格資料</w:t>
       </w:r>
     </w:p>
     <w:p>
@@ -3724,7 +3724,7 @@
         <w:rPr>
           <w:rFonts w:hint="eastAsia"/>
         </w:rPr>
-        <w:t xml:space="preserve">对齐时间序列</w:t>
+        <w:t>對齊時間序列</w:t>
       </w:r>
     </w:p>
     <w:p>
@@ -3739,7 +3739,7 @@
         <w:rPr>
           <w:rFonts w:hint="eastAsia"/>
         </w:rPr>
-        <w:t xml:space="preserve">清理缺失值</w:t>
+        <w:t>清理缺失值</w:t>
       </w:r>
     </w:p>
     <w:p>
@@ -3754,7 +3754,7 @@
         <w:rPr>
           <w:rFonts w:hint="eastAsia"/>
         </w:rPr>
-        <w:t xml:space="preserve">计算每日收益率</w:t>
+        <w:t>計算每日收益率</w:t>
       </w:r>
     </w:p>
     <w:p>
@@ -3769,7 +3769,7 @@
         <w:rPr>
           <w:rFonts w:hint="eastAsia"/>
         </w:rPr>
-        <w:t xml:space="preserve">汇总生成组合收益曲线</w:t>
+        <w:t>彙總生成組合收益曲線</w:t>
       </w:r>
     </w:p>
     <w:p>
@@ -3784,7 +3784,7 @@
         <w:rPr>
           <w:rFonts w:hint="eastAsia"/>
         </w:rPr>
-        <w:t xml:space="preserve">输出指标和可视化数据结构</w:t>
+        <w:t>輸出指標和視覺化資料結構</w:t>
       </w:r>
     </w:p>
     <w:bookmarkEnd w:id="57"/>
@@ -3800,7 +3800,7 @@
         <w:rPr>
           <w:rFonts w:hint="eastAsia"/>
         </w:rPr>
-        <w:t xml:space="preserve">数据风险</w:t>
+        <w:t>資料風險</w:t>
       </w:r>
     </w:p>
     <w:p>
@@ -3815,7 +3815,7 @@
         <w:rPr>
           <w:rFonts w:hint="eastAsia"/>
         </w:rPr>
-        <w:t xml:space="preserve">第三方免费数据源可能偶尔缺失或延迟</w:t>
+        <w:t>第三方免費資料來源可能偶爾缺失或延遲</w:t>
       </w:r>
     </w:p>
     <w:p>
@@ -3830,7 +3830,7 @@
         <w:rPr>
           <w:rFonts w:hint="eastAsia"/>
         </w:rPr>
-        <w:t xml:space="preserve">不同市场资产可能存在交易日不一致问题</w:t>
+        <w:t>不同市場資產可能存在交易日不一致問題</w:t>
       </w:r>
     </w:p>
     <w:p>
@@ -3845,7 +3845,7 @@
         <w:rPr>
           <w:rFonts w:hint="eastAsia"/>
         </w:rPr>
-        <w:t xml:space="preserve">数据口径差异可能影响计算结果</w:t>
+        <w:t>資料口徑差異可能影響計算結果</w:t>
       </w:r>
     </w:p>
     <w:bookmarkEnd w:id="58"/>
@@ -3862,7 +3862,7 @@
         <w:rPr>
           <w:rFonts w:hint="eastAsia"/>
         </w:rPr>
-        <w:t xml:space="preserve">指标体系</w:t>
+        <w:t>指標體系</w:t>
       </w:r>
     </w:p>
     <w:bookmarkStart w:id="60" w:name="产品指标"/>
@@ -3877,7 +3877,7 @@
         <w:rPr>
           <w:rFonts w:hint="eastAsia"/>
         </w:rPr>
-        <w:t xml:space="preserve">产品指标</w:t>
+        <w:t>產品指標</w:t>
       </w:r>
     </w:p>
     <w:p>
@@ -3892,7 +3892,7 @@
         <w:rPr>
           <w:rFonts w:hint="eastAsia"/>
         </w:rPr>
-        <w:t xml:space="preserve">页面访问量</w:t>
+        <w:t>頁面訪問量</w:t>
       </w:r>
     </w:p>
     <w:p>
@@ -3907,7 +3907,7 @@
         <w:rPr>
           <w:rFonts w:hint="eastAsia"/>
         </w:rPr>
-        <w:t xml:space="preserve">分析提交次数</w:t>
+        <w:t>分析提交次數</w:t>
       </w:r>
     </w:p>
     <w:p>
@@ -3922,7 +3922,7 @@
         <w:rPr>
           <w:rFonts w:hint="eastAsia"/>
         </w:rPr>
-        <w:t xml:space="preserve">平均会话时长</w:t>
+        <w:t>平均會話時長</w:t>
       </w:r>
     </w:p>
     <w:p>
@@ -3937,7 +3937,7 @@
         <w:rPr>
           <w:rFonts w:hint="eastAsia"/>
         </w:rPr>
-        <w:t xml:space="preserve">成功完成分析的比例</w:t>
+        <w:t>成功完成分析的比例</w:t>
       </w:r>
     </w:p>
     <w:bookmarkEnd w:id="60"/>
@@ -3953,7 +3953,7 @@
         <w:rPr>
           <w:rFonts w:hint="eastAsia"/>
         </w:rPr>
-        <w:t xml:space="preserve">项目成果指标</w:t>
+        <w:t>專案成果指標</w:t>
       </w:r>
     </w:p>
     <w:p>
@@ -3971,7 +3971,7 @@
         <w:rPr>
           <w:rFonts w:hint="eastAsia"/>
         </w:rPr>
-        <w:t xml:space="preserve">是否按计划上线</w:t>
+        <w:t>是否按計劃上線</w:t>
       </w:r>
     </w:p>
     <w:p>
@@ -3986,7 +3986,7 @@
         <w:rPr>
           <w:rFonts w:hint="eastAsia"/>
         </w:rPr>
-        <w:t xml:space="preserve">是否完成核心图表与</w:t>
+        <w:t>是否完成核心圖表與</w:t>
       </w:r>
       <w:r>
         <w:t xml:space="preserve"> AI Summary</w:t>
@@ -4004,7 +4004,7 @@
         <w:rPr>
           <w:rFonts w:hint="eastAsia"/>
         </w:rPr>
-        <w:t xml:space="preserve">是否可用于求职展示和在线</w:t>
+        <w:t>是否可用於求職展示和線上</w:t>
       </w:r>
       <w:r>
         <w:t xml:space="preserve"> demo</w:t>
@@ -4023,7 +4023,7 @@
         <w:rPr>
           <w:rFonts w:hint="eastAsia"/>
         </w:rPr>
-        <w:t xml:space="preserve">分析指标</w:t>
+        <w:t>分析指標</w:t>
       </w:r>
     </w:p>
     <w:p>
@@ -4035,7 +4035,7 @@
         </w:numPr>
       </w:pPr>
       <w:r>
-        <w:t xml:space="preserve">Cumulative Return</w:t>
+        <w:t>Cumulative Return</w:t>
       </w:r>
     </w:p>
     <w:p>
@@ -4047,7 +4047,7 @@
         </w:numPr>
       </w:pPr>
       <w:r>
-        <w:t xml:space="preserve">Annualized Return</w:t>
+        <w:t>Annualized Return</w:t>
       </w:r>
     </w:p>
     <w:p>
@@ -4059,7 +4059,7 @@
         </w:numPr>
       </w:pPr>
       <w:r>
-        <w:t xml:space="preserve">Annualized Volatility</w:t>
+        <w:t>Annualized Volatility</w:t>
       </w:r>
     </w:p>
     <w:p>
@@ -4071,7 +4071,7 @@
         </w:numPr>
       </w:pPr>
       <w:r>
-        <w:t xml:space="preserve">Sharpe Ratio</w:t>
+        <w:t>Sharpe Ratio</w:t>
       </w:r>
     </w:p>
     <w:p>
@@ -4083,7 +4083,7 @@
         </w:numPr>
       </w:pPr>
       <w:r>
-        <w:t xml:space="preserve">Maximum Drawdown</w:t>
+        <w:t>Maximum Drawdown</w:t>
       </w:r>
     </w:p>
     <w:p>
@@ -4095,7 +4095,7 @@
         </w:numPr>
       </w:pPr>
       <w:r>
-        <w:t xml:space="preserve">Correlation Matrix</w:t>
+        <w:t>Correlation Matrix</w:t>
       </w:r>
     </w:p>
     <w:bookmarkEnd w:id="62"/>
@@ -4112,7 +4112,7 @@
         <w:rPr>
           <w:rFonts w:hint="eastAsia"/>
         </w:rPr>
-        <w:t xml:space="preserve">项目里程碑与</w:t>
+        <w:t>專案里程碑與</w:t>
       </w:r>
       <w:r>
         <w:t xml:space="preserve"> Milestones</w:t>
@@ -4130,7 +4130,7 @@
         <w:rPr>
           <w:rFonts w:hint="eastAsia"/>
         </w:rPr>
-        <w:t xml:space="preserve">1：项目定义与设计完成</w:t>
+        <w:t>1：專案定義與設計完成</w:t>
       </w:r>
     </w:p>
     <w:p>
@@ -4143,7 +4143,7 @@
           <w:b/>
           <w:bCs/>
         </w:rPr>
-        <w:t xml:space="preserve">时间</w:t>
+        <w:t>時間</w:t>
       </w:r>
       <w:r>
         <w:t xml:space="preserve"> </w:t>
@@ -4152,7 +4152,7 @@
         <w:rPr>
           <w:rFonts w:hint="eastAsia"/>
         </w:rPr>
-        <w:t xml:space="preserve">第</w:t>
+        <w:t>第</w:t>
       </w:r>
       <w:r>
         <w:t xml:space="preserve"> 1 </w:t>
@@ -4161,7 +4161,7 @@
         <w:rPr>
           <w:rFonts w:hint="eastAsia"/>
         </w:rPr>
-        <w:t xml:space="preserve">周前半段</w:t>
+        <w:t>周前半段</w:t>
       </w:r>
     </w:p>
     <w:p>
@@ -4174,7 +4174,7 @@
           <w:b/>
           <w:bCs/>
         </w:rPr>
-        <w:t xml:space="preserve">目标</w:t>
+        <w:t>目標</w:t>
       </w:r>
     </w:p>
     <w:p>
@@ -4189,7 +4189,7 @@
         <w:rPr>
           <w:rFonts w:hint="eastAsia"/>
         </w:rPr>
-        <w:t xml:space="preserve">明确</w:t>
+        <w:t>明確</w:t>
       </w:r>
       <w:r>
         <w:t xml:space="preserve"> MVP </w:t>
@@ -4198,7 +4198,7 @@
         <w:rPr>
           <w:rFonts w:hint="eastAsia"/>
         </w:rPr>
-        <w:t xml:space="preserve">范围</w:t>
+        <w:t>範圍</w:t>
       </w:r>
     </w:p>
     <w:p>
@@ -4213,7 +4213,7 @@
         <w:rPr>
           <w:rFonts w:hint="eastAsia"/>
         </w:rPr>
-        <w:t xml:space="preserve">完成功能拆解</w:t>
+        <w:t>完成功能拆解</w:t>
       </w:r>
     </w:p>
     <w:p>
@@ -4228,7 +4228,7 @@
         <w:rPr>
           <w:rFonts w:hint="eastAsia"/>
         </w:rPr>
-        <w:t xml:space="preserve">输出页面草图与技术选型</w:t>
+        <w:t>輸出頁面草圖與技術選型</w:t>
       </w:r>
     </w:p>
     <w:p>
@@ -4241,7 +4241,7 @@
           <w:b/>
           <w:bCs/>
         </w:rPr>
-        <w:t xml:space="preserve">交付物</w:t>
+        <w:t>交付物</w:t>
       </w:r>
     </w:p>
     <w:p>
@@ -4256,7 +4256,7 @@
         <w:rPr>
           <w:rFonts w:hint="eastAsia"/>
         </w:rPr>
-        <w:t xml:space="preserve">项目需求文档</w:t>
+        <w:t>專案需求文件</w:t>
       </w:r>
     </w:p>
     <w:p>
@@ -4271,7 +4271,7 @@
         <w:rPr>
           <w:rFonts w:hint="eastAsia"/>
         </w:rPr>
-        <w:t xml:space="preserve">页面结构草图</w:t>
+        <w:t>頁面結構草圖</w:t>
       </w:r>
     </w:p>
     <w:p>
@@ -4286,7 +4286,7 @@
         <w:rPr>
           <w:rFonts w:hint="eastAsia"/>
         </w:rPr>
-        <w:t xml:space="preserve">技术方案说明</w:t>
+        <w:t>技術方案說明</w:t>
       </w:r>
     </w:p>
     <w:bookmarkEnd w:id="64"/>
@@ -4302,7 +4302,7 @@
         <w:rPr>
           <w:rFonts w:hint="eastAsia"/>
         </w:rPr>
-        <w:t xml:space="preserve">2：后端分析能力完成</w:t>
+        <w:t>2：後端分析能力完成</w:t>
       </w:r>
     </w:p>
     <w:p>
@@ -4315,7 +4315,7 @@
           <w:b/>
           <w:bCs/>
         </w:rPr>
-        <w:t xml:space="preserve">时间</w:t>
+        <w:t>時間</w:t>
       </w:r>
       <w:r>
         <w:t xml:space="preserve"> </w:t>
@@ -4324,7 +4324,7 @@
         <w:rPr>
           <w:rFonts w:hint="eastAsia"/>
         </w:rPr>
-        <w:t xml:space="preserve">第</w:t>
+        <w:t>第</w:t>
       </w:r>
       <w:r>
         <w:t xml:space="preserve"> 1 </w:t>
@@ -4333,7 +4333,7 @@
         <w:rPr>
           <w:rFonts w:hint="eastAsia"/>
         </w:rPr>
-        <w:t xml:space="preserve">周后半段</w:t>
+        <w:t>周後半段</w:t>
       </w:r>
     </w:p>
     <w:p>
@@ -4346,7 +4346,7 @@
           <w:b/>
           <w:bCs/>
         </w:rPr>
-        <w:t xml:space="preserve">目标</w:t>
+        <w:t>目標</w:t>
       </w:r>
     </w:p>
     <w:p>
@@ -4361,7 +4361,7 @@
         <w:rPr>
           <w:rFonts w:hint="eastAsia"/>
         </w:rPr>
-        <w:t xml:space="preserve">接入历史价格数据</w:t>
+        <w:t>接入歷史價格資料</w:t>
       </w:r>
     </w:p>
     <w:p>
@@ -4376,7 +4376,7 @@
         <w:rPr>
           <w:rFonts w:hint="eastAsia"/>
         </w:rPr>
-        <w:t xml:space="preserve">完成收益与风险指标计算</w:t>
+        <w:t>完成收益與風險指標計算</w:t>
       </w:r>
       <w:r>
         <w:t xml:space="preserve"> API</w:t>
@@ -4392,7 +4392,7 @@
           <w:b/>
           <w:bCs/>
         </w:rPr>
-        <w:t xml:space="preserve">交付物</w:t>
+        <w:t>交付物</w:t>
       </w:r>
     </w:p>
     <w:p>
@@ -4407,7 +4407,7 @@
         <w:rPr>
           <w:rFonts w:hint="eastAsia"/>
         </w:rPr>
-        <w:t xml:space="preserve">数据获取模块</w:t>
+        <w:t>資料獲取模組</w:t>
       </w:r>
     </w:p>
     <w:p>
@@ -4422,7 +4422,7 @@
         <w:rPr>
           <w:rFonts w:hint="eastAsia"/>
         </w:rPr>
-        <w:t xml:space="preserve">指标计算模块</w:t>
+        <w:t>指標計算模組</w:t>
       </w:r>
     </w:p>
     <w:p>
@@ -4437,7 +4437,7 @@
         <w:rPr>
           <w:rFonts w:hint="eastAsia"/>
         </w:rPr>
-        <w:t xml:space="preserve">可测试的</w:t>
+        <w:t>可測試的</w:t>
       </w:r>
       <w:r>
         <w:t xml:space="preserve"> API </w:t>
@@ -4446,7 +4446,7 @@
         <w:rPr>
           <w:rFonts w:hint="eastAsia"/>
         </w:rPr>
-        <w:t xml:space="preserve">接口</w:t>
+        <w:t>介面</w:t>
       </w:r>
     </w:p>
     <w:bookmarkEnd w:id="65"/>
@@ -4462,7 +4462,7 @@
         <w:rPr>
           <w:rFonts w:hint="eastAsia"/>
         </w:rPr>
-        <w:t xml:space="preserve">3：前端展示完成</w:t>
+        <w:t>3：前端展示完成</w:t>
       </w:r>
     </w:p>
     <w:p>
@@ -4475,7 +4475,7 @@
           <w:b/>
           <w:bCs/>
         </w:rPr>
-        <w:t xml:space="preserve">时间</w:t>
+        <w:t>時間</w:t>
       </w:r>
       <w:r>
         <w:t xml:space="preserve"> </w:t>
@@ -4484,7 +4484,7 @@
         <w:rPr>
           <w:rFonts w:hint="eastAsia"/>
         </w:rPr>
-        <w:t xml:space="preserve">第</w:t>
+        <w:t>第</w:t>
       </w:r>
       <w:r>
         <w:t xml:space="preserve"> 2 </w:t>
@@ -4493,7 +4493,7 @@
         <w:rPr>
           <w:rFonts w:hint="eastAsia"/>
         </w:rPr>
-        <w:t xml:space="preserve">周前半段</w:t>
+        <w:t>周前半段</w:t>
       </w:r>
     </w:p>
     <w:p>
@@ -4506,7 +4506,7 @@
           <w:b/>
           <w:bCs/>
         </w:rPr>
-        <w:t xml:space="preserve">目标</w:t>
+        <w:t>目標</w:t>
       </w:r>
     </w:p>
     <w:p>
@@ -4521,7 +4521,7 @@
         <w:rPr>
           <w:rFonts w:hint="eastAsia"/>
         </w:rPr>
-        <w:t xml:space="preserve">完成输入页与结果页</w:t>
+        <w:t>完成輸入頁與結果頁</w:t>
       </w:r>
     </w:p>
     <w:p>
@@ -4536,7 +4536,7 @@
         <w:rPr>
           <w:rFonts w:hint="eastAsia"/>
         </w:rPr>
-        <w:t xml:space="preserve">实现核心图表展示</w:t>
+        <w:t>實現核心圖表展示</w:t>
       </w:r>
     </w:p>
     <w:p>
@@ -4549,7 +4549,7 @@
           <w:b/>
           <w:bCs/>
         </w:rPr>
-        <w:t xml:space="preserve">交付物</w:t>
+        <w:t>交付物</w:t>
       </w:r>
     </w:p>
     <w:p>
@@ -4564,7 +4564,7 @@
         <w:rPr>
           <w:rFonts w:hint="eastAsia"/>
         </w:rPr>
-        <w:t xml:space="preserve">可提交分析的前端界面</w:t>
+        <w:t>可提交分析的前端介面</w:t>
       </w:r>
     </w:p>
     <w:p>
@@ -4582,7 +4582,7 @@
         <w:rPr>
           <w:rFonts w:hint="eastAsia"/>
         </w:rPr>
-        <w:t xml:space="preserve">结果展示页</w:t>
+        <w:t>結果展示頁</w:t>
       </w:r>
     </w:p>
     <w:bookmarkEnd w:id="66"/>
@@ -4598,7 +4598,7 @@
         <w:rPr>
           <w:rFonts w:hint="eastAsia"/>
         </w:rPr>
-        <w:t xml:space="preserve">4：AI</w:t>
+        <w:t>4：AI</w:t>
       </w:r>
       <w:r>
         <w:t xml:space="preserve"> Summary </w:t>
@@ -4607,7 +4607,7 @@
         <w:rPr>
           <w:rFonts w:hint="eastAsia"/>
         </w:rPr>
-        <w:t xml:space="preserve">与优化完成</w:t>
+        <w:t>與最佳化完成</w:t>
       </w:r>
     </w:p>
     <w:p>
@@ -4620,7 +4620,7 @@
           <w:b/>
           <w:bCs/>
         </w:rPr>
-        <w:t xml:space="preserve">时间</w:t>
+        <w:t>時間</w:t>
       </w:r>
       <w:r>
         <w:t xml:space="preserve"> </w:t>
@@ -4629,7 +4629,7 @@
         <w:rPr>
           <w:rFonts w:hint="eastAsia"/>
         </w:rPr>
-        <w:t xml:space="preserve">第</w:t>
+        <w:t>第</w:t>
       </w:r>
       <w:r>
         <w:t xml:space="preserve"> 2 </w:t>
@@ -4638,7 +4638,7 @@
         <w:rPr>
           <w:rFonts w:hint="eastAsia"/>
         </w:rPr>
-        <w:t xml:space="preserve">周中后段</w:t>
+        <w:t>週中後段</w:t>
       </w:r>
     </w:p>
     <w:p>
@@ -4651,7 +4651,7 @@
           <w:b/>
           <w:bCs/>
         </w:rPr>
-        <w:t xml:space="preserve">目标</w:t>
+        <w:t>目標</w:t>
       </w:r>
     </w:p>
     <w:p>
@@ -4666,7 +4666,7 @@
         <w:rPr>
           <w:rFonts w:hint="eastAsia"/>
         </w:rPr>
-        <w:t xml:space="preserve">接入</w:t>
+        <w:t>接入</w:t>
       </w:r>
       <w:r>
         <w:t xml:space="preserve"> AI </w:t>
@@ -4675,7 +4675,7 @@
         <w:rPr>
           <w:rFonts w:hint="eastAsia"/>
         </w:rPr>
-        <w:t xml:space="preserve">文本总结</w:t>
+        <w:t>文字總結</w:t>
       </w:r>
     </w:p>
     <w:p>
@@ -4690,7 +4690,7 @@
         <w:rPr>
           <w:rFonts w:hint="eastAsia"/>
         </w:rPr>
-        <w:t xml:space="preserve">优化</w:t>
+        <w:t>最佳化</w:t>
       </w:r>
       <w:r>
         <w:t xml:space="preserve"> UI </w:t>
@@ -4699,7 +4699,7 @@
         <w:rPr>
           <w:rFonts w:hint="eastAsia"/>
         </w:rPr>
-        <w:t xml:space="preserve">和用户体验</w:t>
+        <w:t>和使用者體驗</w:t>
       </w:r>
     </w:p>
     <w:p>
@@ -4714,7 +4714,7 @@
         <w:rPr>
           <w:rFonts w:hint="eastAsia"/>
         </w:rPr>
-        <w:t xml:space="preserve">修复关键</w:t>
+        <w:t>修復關鍵</w:t>
       </w:r>
       <w:r>
         <w:t xml:space="preserve"> bug</w:t>
@@ -4730,7 +4730,7 @@
           <w:b/>
           <w:bCs/>
         </w:rPr>
-        <w:t xml:space="preserve">交付物</w:t>
+        <w:t>交付物</w:t>
       </w:r>
     </w:p>
     <w:p>
@@ -4748,7 +4748,7 @@
         <w:rPr>
           <w:rFonts w:hint="eastAsia"/>
         </w:rPr>
-        <w:t xml:space="preserve">模块</w:t>
+        <w:t>模組</w:t>
       </w:r>
     </w:p>
     <w:p>
@@ -4763,7 +4763,7 @@
         <w:rPr>
           <w:rFonts w:hint="eastAsia"/>
         </w:rPr>
-        <w:t xml:space="preserve">优化后的界面</w:t>
+        <w:t>最佳化後的介面</w:t>
       </w:r>
     </w:p>
     <w:p>
@@ -4778,7 +4778,7 @@
         <w:rPr>
           <w:rFonts w:hint="eastAsia"/>
         </w:rPr>
-        <w:t xml:space="preserve">稳定演示版本</w:t>
+        <w:t>穩定演示版本</w:t>
       </w:r>
     </w:p>
     <w:bookmarkEnd w:id="67"/>
@@ -4794,7 +4794,7 @@
         <w:rPr>
           <w:rFonts w:hint="eastAsia"/>
         </w:rPr>
-        <w:t xml:space="preserve">5：部署与项目包装完成</w:t>
+        <w:t>5：部署與專案包裝完成</w:t>
       </w:r>
     </w:p>
     <w:p>
@@ -4807,7 +4807,7 @@
           <w:b/>
           <w:bCs/>
         </w:rPr>
-        <w:t xml:space="preserve">时间</w:t>
+        <w:t>時間</w:t>
       </w:r>
       <w:r>
         <w:t xml:space="preserve"> </w:t>
@@ -4816,7 +4816,7 @@
         <w:rPr>
           <w:rFonts w:hint="eastAsia"/>
         </w:rPr>
-        <w:t xml:space="preserve">第</w:t>
+        <w:t>第</w:t>
       </w:r>
       <w:r>
         <w:t xml:space="preserve"> 2 </w:t>
@@ -4825,7 +4825,7 @@
         <w:rPr>
           <w:rFonts w:hint="eastAsia"/>
         </w:rPr>
-        <w:t xml:space="preserve">周末</w:t>
+        <w:t>週末</w:t>
       </w:r>
     </w:p>
     <w:p>
@@ -4838,7 +4838,7 @@
           <w:b/>
           <w:bCs/>
         </w:rPr>
-        <w:t xml:space="preserve">目标</w:t>
+        <w:t>目標</w:t>
       </w:r>
     </w:p>
     <w:p>
@@ -4853,7 +4853,7 @@
         <w:rPr>
           <w:rFonts w:hint="eastAsia"/>
         </w:rPr>
-        <w:t xml:space="preserve">完成线上部署</w:t>
+        <w:t>完成線上部署</w:t>
       </w:r>
     </w:p>
     <w:p>
@@ -4868,7 +4868,7 @@
         <w:rPr>
           <w:rFonts w:hint="eastAsia"/>
         </w:rPr>
-        <w:t xml:space="preserve">准备</w:t>
+        <w:t>準備</w:t>
       </w:r>
       <w:r>
         <w:t xml:space="preserve"> </w:t>
@@ -4877,7 +4877,7 @@
         <w:rPr>
           <w:rFonts w:hint="eastAsia"/>
         </w:rPr>
-        <w:t xml:space="preserve">README、截图和简历描述</w:t>
+        <w:t>README、截圖和簡歷描述</w:t>
       </w:r>
     </w:p>
     <w:p>
@@ -4890,7 +4890,7 @@
           <w:b/>
           <w:bCs/>
         </w:rPr>
-        <w:t xml:space="preserve">交付物</w:t>
+        <w:t>交付物</w:t>
       </w:r>
     </w:p>
     <w:p>
@@ -4905,7 +4905,7 @@
         <w:rPr>
           <w:rFonts w:hint="eastAsia"/>
         </w:rPr>
-        <w:t xml:space="preserve">在线</w:t>
+        <w:t>線上</w:t>
       </w:r>
       <w:r>
         <w:t xml:space="preserve"> demo</w:t>
@@ -4926,7 +4926,7 @@
         <w:rPr>
           <w:rFonts w:hint="eastAsia"/>
         </w:rPr>
-        <w:t xml:space="preserve">仓库</w:t>
+        <w:t>倉庫</w:t>
       </w:r>
     </w:p>
     <w:p>
@@ -4941,7 +4941,7 @@
         <w:rPr>
           <w:rFonts w:hint="eastAsia"/>
         </w:rPr>
-        <w:t xml:space="preserve">项目介绍材料</w:t>
+        <w:t>專案介紹材料</w:t>
       </w:r>
     </w:p>
     <w:bookmarkEnd w:id="68"/>
@@ -4958,7 +4958,7 @@
         <w:rPr>
           <w:rFonts w:hint="eastAsia"/>
         </w:rPr>
-        <w:t xml:space="preserve">开发计划</w:t>
+        <w:t>開發計劃</w:t>
       </w:r>
     </w:p>
     <w:bookmarkStart w:id="70" w:name="week-1"/>
@@ -4967,7 +4967,7 @@
         <w:pStyle w:val="Heading4"/>
       </w:pPr>
       <w:r>
-        <w:t xml:space="preserve">Week 1</w:t>
+        <w:t>Week 1</w:t>
       </w:r>
     </w:p>
     <w:p>
@@ -4979,7 +4979,7 @@
           <w:b/>
           <w:bCs/>
         </w:rPr>
-        <w:t xml:space="preserve">Day 1</w:t>
+        <w:t>Day 1</w:t>
       </w:r>
     </w:p>
     <w:p>
@@ -4994,7 +4994,7 @@
         <w:rPr>
           <w:rFonts w:hint="eastAsia"/>
         </w:rPr>
-        <w:t xml:space="preserve">项目启动</w:t>
+        <w:t>專案啟動</w:t>
       </w:r>
     </w:p>
     <w:p>
@@ -5009,7 +5009,7 @@
         <w:rPr>
           <w:rFonts w:hint="eastAsia"/>
         </w:rPr>
-        <w:t xml:space="preserve">确认需求范围</w:t>
+        <w:t>確認需求範圍</w:t>
       </w:r>
     </w:p>
     <w:p>
@@ -5024,7 +5024,7 @@
         <w:rPr>
           <w:rFonts w:hint="eastAsia"/>
         </w:rPr>
-        <w:t xml:space="preserve">搭建前后端项目结构</w:t>
+        <w:t>搭建前後端專案結構</w:t>
       </w:r>
     </w:p>
     <w:p>
@@ -5036,7 +5036,7 @@
           <w:b/>
           <w:bCs/>
         </w:rPr>
-        <w:t xml:space="preserve">Day 2</w:t>
+        <w:t>Day 2</w:t>
       </w:r>
     </w:p>
     <w:p>
@@ -5051,7 +5051,7 @@
         <w:rPr>
           <w:rFonts w:hint="eastAsia"/>
         </w:rPr>
-        <w:t xml:space="preserve">接入价格数据</w:t>
+        <w:t>接入價格資料</w:t>
       </w:r>
       <w:r>
         <w:t xml:space="preserve"> API</w:t>
@@ -5069,7 +5069,7 @@
         <w:rPr>
           <w:rFonts w:hint="eastAsia"/>
         </w:rPr>
-        <w:t xml:space="preserve">完成数据抓取与清洗逻辑</w:t>
+        <w:t>完成資料抓取與清洗邏輯</w:t>
       </w:r>
     </w:p>
     <w:p>
@@ -5081,7 +5081,7 @@
           <w:b/>
           <w:bCs/>
         </w:rPr>
-        <w:t xml:space="preserve">Day 3</w:t>
+        <w:t>Day 3</w:t>
       </w:r>
     </w:p>
     <w:p>
@@ -5096,7 +5096,7 @@
         <w:rPr>
           <w:rFonts w:hint="eastAsia"/>
         </w:rPr>
-        <w:t xml:space="preserve">完成收益、波动率、Sharpe</w:t>
+        <w:t>完成收益、波動率、Sharpe</w:t>
       </w:r>
       <w:r>
         <w:t xml:space="preserve"> </w:t>
@@ -5105,7 +5105,7 @@
         <w:rPr>
           <w:rFonts w:hint="eastAsia"/>
         </w:rPr>
-        <w:t xml:space="preserve">Ratio、回撤计算</w:t>
+        <w:t>Ratio、回撤計算</w:t>
       </w:r>
     </w:p>
     <w:p>
@@ -5117,7 +5117,7 @@
           <w:b/>
           <w:bCs/>
         </w:rPr>
-        <w:t xml:space="preserve">Day 4</w:t>
+        <w:t>Day 4</w:t>
       </w:r>
     </w:p>
     <w:p>
@@ -5132,7 +5132,7 @@
         <w:rPr>
           <w:rFonts w:hint="eastAsia"/>
         </w:rPr>
-        <w:t xml:space="preserve">完成输入页表单与交互逻辑</w:t>
+        <w:t>完成輸入頁表單與互動邏輯</w:t>
       </w:r>
     </w:p>
     <w:p>
@@ -5144,7 +5144,7 @@
           <w:b/>
           <w:bCs/>
         </w:rPr>
-        <w:t xml:space="preserve">Day 5</w:t>
+        <w:t>Day 5</w:t>
       </w:r>
     </w:p>
     <w:p>
@@ -5159,7 +5159,7 @@
         <w:rPr>
           <w:rFonts w:hint="eastAsia"/>
         </w:rPr>
-        <w:t xml:space="preserve">完成结果页基础图表和</w:t>
+        <w:t>完成結果頁基礎圖表和</w:t>
       </w:r>
       <w:r>
         <w:t xml:space="preserve"> KPI </w:t>
@@ -5168,7 +5168,7 @@
         <w:rPr>
           <w:rFonts w:hint="eastAsia"/>
         </w:rPr>
-        <w:t xml:space="preserve">卡片</w:t>
+        <w:t>卡片</w:t>
       </w:r>
     </w:p>
     <w:bookmarkEnd w:id="70"/>
@@ -5178,7 +5178,7 @@
         <w:pStyle w:val="Heading4"/>
       </w:pPr>
       <w:r>
-        <w:t xml:space="preserve">Week 2</w:t>
+        <w:t>Week 2</w:t>
       </w:r>
     </w:p>
     <w:p>
@@ -5190,7 +5190,7 @@
           <w:b/>
           <w:bCs/>
         </w:rPr>
-        <w:t xml:space="preserve">Day 6</w:t>
+        <w:t>Day 6</w:t>
       </w:r>
     </w:p>
     <w:p>
@@ -5205,7 +5205,7 @@
         <w:rPr>
           <w:rFonts w:hint="eastAsia"/>
         </w:rPr>
-        <w:t xml:space="preserve">完成相关性热力图与</w:t>
+        <w:t>完成相關性熱力圖與</w:t>
       </w:r>
       <w:r>
         <w:t xml:space="preserve"> benchmark </w:t>
@@ -5214,7 +5214,7 @@
         <w:rPr>
           <w:rFonts w:hint="eastAsia"/>
         </w:rPr>
-        <w:t xml:space="preserve">对比</w:t>
+        <w:t>對比</w:t>
       </w:r>
     </w:p>
     <w:p>
@@ -5226,7 +5226,7 @@
           <w:b/>
           <w:bCs/>
         </w:rPr>
-        <w:t xml:space="preserve">Day 7</w:t>
+        <w:t>Day 7</w:t>
       </w:r>
     </w:p>
     <w:p>
@@ -5241,7 +5241,7 @@
         <w:rPr>
           <w:rFonts w:hint="eastAsia"/>
         </w:rPr>
-        <w:t xml:space="preserve">接入</w:t>
+        <w:t>接入</w:t>
       </w:r>
       <w:r>
         <w:t xml:space="preserve"> AI </w:t>
@@ -5250,7 +5250,7 @@
         <w:rPr>
           <w:rFonts w:hint="eastAsia"/>
         </w:rPr>
-        <w:t xml:space="preserve">总结模块</w:t>
+        <w:t>總結模組</w:t>
       </w:r>
     </w:p>
     <w:p>
@@ -5262,7 +5262,7 @@
           <w:b/>
           <w:bCs/>
         </w:rPr>
-        <w:t xml:space="preserve">Day 8</w:t>
+        <w:t>Day 8</w:t>
       </w:r>
     </w:p>
     <w:p>
@@ -5277,7 +5277,7 @@
         <w:rPr>
           <w:rFonts w:hint="eastAsia"/>
         </w:rPr>
-        <w:t xml:space="preserve">优化页面布局与视觉展示</w:t>
+        <w:t>最佳化頁面佈局與視覺展示</w:t>
       </w:r>
     </w:p>
     <w:p>
@@ -5289,7 +5289,7 @@
           <w:b/>
           <w:bCs/>
         </w:rPr>
-        <w:t xml:space="preserve">Day 9</w:t>
+        <w:t>Day 9</w:t>
       </w:r>
     </w:p>
     <w:p>
@@ -5304,7 +5304,7 @@
         <w:rPr>
           <w:rFonts w:hint="eastAsia"/>
         </w:rPr>
-        <w:t xml:space="preserve">测试与</w:t>
+        <w:t>測試與</w:t>
       </w:r>
       <w:r>
         <w:t xml:space="preserve"> bug </w:t>
@@ -5313,7 +5313,7 @@
         <w:rPr>
           <w:rFonts w:hint="eastAsia"/>
         </w:rPr>
-        <w:t xml:space="preserve">修复</w:t>
+        <w:t>修復</w:t>
       </w:r>
     </w:p>
     <w:p>
@@ -5325,7 +5325,7 @@
           <w:b/>
           <w:bCs/>
         </w:rPr>
-        <w:t xml:space="preserve">Day 10</w:t>
+        <w:t>Day 10</w:t>
       </w:r>
     </w:p>
     <w:p>
@@ -5340,7 +5340,7 @@
         <w:rPr>
           <w:rFonts w:hint="eastAsia"/>
         </w:rPr>
-        <w:t xml:space="preserve">部署上线</w:t>
+        <w:t>部署上線</w:t>
       </w:r>
     </w:p>
     <w:p>
@@ -5355,7 +5355,7 @@
         <w:rPr>
           <w:rFonts w:hint="eastAsia"/>
         </w:rPr>
-        <w:t xml:space="preserve">完成</w:t>
+        <w:t>完成</w:t>
       </w:r>
       <w:r>
         <w:t xml:space="preserve"> </w:t>
@@ -5364,7 +5364,7 @@
         <w:rPr>
           <w:rFonts w:hint="eastAsia"/>
         </w:rPr>
-        <w:t xml:space="preserve">README、截图、汇报材料</w:t>
+        <w:t>README、截圖、彙報材料</w:t>
       </w:r>
     </w:p>
     <w:bookmarkEnd w:id="71"/>
@@ -5381,7 +5381,7 @@
         <w:rPr>
           <w:rFonts w:hint="eastAsia"/>
         </w:rPr>
-        <w:t xml:space="preserve">角色分工建议</w:t>
+        <w:t>角色分工建議</w:t>
       </w:r>
     </w:p>
     <w:p>
@@ -5392,7 +5392,7 @@
         <w:rPr>
           <w:rFonts w:hint="eastAsia"/>
         </w:rPr>
-        <w:t xml:space="preserve">如果该项目由个人独立完成，则所有角色由同一人承担。若以后扩展为团队项目，可参考以下角色：</w:t>
+        <w:t>如果該專案由個人獨立完成，則所有角色由同一人承擔。若以後擴充套件為團隊專案，可參考以下角色：</w:t>
       </w:r>
     </w:p>
     <w:p>
@@ -5410,7 +5410,7 @@
         <w:rPr>
           <w:rFonts w:hint="eastAsia"/>
         </w:rPr>
-        <w:t xml:space="preserve">Manager：需求定义、项目规划、优先级和交付管理</w:t>
+        <w:t>Manager：需求定義、專案規劃、優先順序和交付管理</w:t>
       </w:r>
     </w:p>
     <w:p>
@@ -5428,7 +5428,7 @@
         <w:rPr>
           <w:rFonts w:hint="eastAsia"/>
         </w:rPr>
-        <w:t xml:space="preserve">Developer：页面开发与可视化实现</w:t>
+        <w:t>Developer：頁面開發與視覺化實現</w:t>
       </w:r>
     </w:p>
     <w:p>
@@ -5446,7 +5446,7 @@
         <w:rPr>
           <w:rFonts w:hint="eastAsia"/>
         </w:rPr>
-        <w:t xml:space="preserve">Developer：API、数据分析逻辑与服务整合</w:t>
+        <w:t>Developer：API、資料分析邏輯與服務整合</w:t>
       </w:r>
     </w:p>
     <w:p>
@@ -5464,7 +5464,7 @@
         <w:rPr>
           <w:rFonts w:hint="eastAsia"/>
         </w:rPr>
-        <w:t xml:space="preserve">Scientist：指标设计、数据处理、分析验证</w:t>
+        <w:t>Scientist：指標設計、資料處理、分析驗證</w:t>
       </w:r>
     </w:p>
     <w:p>
@@ -5482,7 +5482,7 @@
         <w:rPr>
           <w:rFonts w:hint="eastAsia"/>
         </w:rPr>
-        <w:t xml:space="preserve">Engineer：LLM</w:t>
+        <w:t>Engineer：LLM</w:t>
       </w:r>
       <w:r>
         <w:t xml:space="preserve"> </w:t>
@@ -5491,7 +5491,7 @@
         <w:rPr>
           <w:rFonts w:hint="eastAsia"/>
         </w:rPr>
-        <w:t xml:space="preserve">接入、Prompt</w:t>
+        <w:t>接入、Prompt</w:t>
       </w:r>
       <w:r>
         <w:t xml:space="preserve"> </w:t>
@@ -5500,7 +5500,7 @@
         <w:rPr>
           <w:rFonts w:hint="eastAsia"/>
         </w:rPr>
-        <w:t xml:space="preserve">设计、AI</w:t>
+        <w:t>設計、AI</w:t>
       </w:r>
       <w:r>
         <w:t xml:space="preserve"> </w:t>
@@ -5509,7 +5509,7 @@
         <w:rPr>
           <w:rFonts w:hint="eastAsia"/>
         </w:rPr>
-        <w:t xml:space="preserve">输出控制</w:t>
+        <w:t>輸出控制</w:t>
       </w:r>
     </w:p>
     <w:bookmarkEnd w:id="73"/>
@@ -5525,7 +5525,7 @@
         <w:rPr>
           <w:rFonts w:hint="eastAsia"/>
         </w:rPr>
-        <w:t xml:space="preserve">风险分析与应对策略</w:t>
+        <w:t>風險分析與應對策略</w:t>
       </w:r>
     </w:p>
     <w:bookmarkStart w:id="74" w:name="风险一项目范围过大"/>
@@ -5537,7 +5537,7 @@
         <w:rPr>
           <w:rFonts w:hint="eastAsia"/>
         </w:rPr>
-        <w:t xml:space="preserve">风险一：项目范围过大</w:t>
+        <w:t>風險一：專案範圍過大</w:t>
       </w:r>
     </w:p>
     <w:p>
@@ -5550,7 +5550,7 @@
           <w:b/>
           <w:bCs/>
         </w:rPr>
-        <w:t xml:space="preserve">风险描述</w:t>
+        <w:t>風險描述</w:t>
       </w:r>
       <w:r>
         <w:t xml:space="preserve"> </w:t>
@@ -5559,7 +5559,7 @@
         <w:rPr>
           <w:rFonts w:hint="eastAsia"/>
         </w:rPr>
-        <w:t xml:space="preserve">如果一开始加入基本面分析、行业趋势、宏观分析和优化模型，项目很容易失控。</w:t>
+        <w:t>如果一開始加入基本面分析、行業趨勢、宏觀分析和最佳化模型，專案很容易失控。</w:t>
       </w:r>
     </w:p>
     <w:p>
@@ -5572,7 +5572,7 @@
           <w:b/>
           <w:bCs/>
         </w:rPr>
-        <w:t xml:space="preserve">应对策略</w:t>
+        <w:t>應對策略</w:t>
       </w:r>
     </w:p>
     <w:p>
@@ -5587,7 +5587,7 @@
         <w:rPr>
           <w:rFonts w:hint="eastAsia"/>
         </w:rPr>
-        <w:t xml:space="preserve">明确</w:t>
+        <w:t>明確</w:t>
       </w:r>
       <w:r>
         <w:t xml:space="preserve"> MVP </w:t>
@@ -5596,7 +5596,7 @@
         <w:rPr>
           <w:rFonts w:hint="eastAsia"/>
         </w:rPr>
-        <w:t xml:space="preserve">只做价格驱动的分析</w:t>
+        <w:t>只做價格驅動的分析</w:t>
       </w:r>
     </w:p>
     <w:p>
@@ -5611,7 +5611,7 @@
         <w:rPr>
           <w:rFonts w:hint="eastAsia"/>
         </w:rPr>
-        <w:t xml:space="preserve">采用分阶段开发策略</w:t>
+        <w:t>採用分階段開發策略</w:t>
       </w:r>
     </w:p>
     <w:bookmarkEnd w:id="74"/>
@@ -5624,7 +5624,7 @@
         <w:rPr>
           <w:rFonts w:hint="eastAsia"/>
         </w:rPr>
-        <w:t xml:space="preserve">风险二：金融分析逻辑复杂</w:t>
+        <w:t>風險二：金融分析邏輯複雜</w:t>
       </w:r>
     </w:p>
     <w:p>
@@ -5637,7 +5637,7 @@
           <w:b/>
           <w:bCs/>
         </w:rPr>
-        <w:t xml:space="preserve">风险描述</w:t>
+        <w:t>風險描述</w:t>
       </w:r>
       <w:r>
         <w:t xml:space="preserve"> </w:t>
@@ -5646,7 +5646,7 @@
         <w:rPr>
           <w:rFonts w:hint="eastAsia"/>
         </w:rPr>
-        <w:t xml:space="preserve">指标定义不清晰会影响项目可信度。</w:t>
+        <w:t>指標定義不清晰會影響專案可信度。</w:t>
       </w:r>
     </w:p>
     <w:p>
@@ -5659,7 +5659,7 @@
           <w:b/>
           <w:bCs/>
         </w:rPr>
-        <w:t xml:space="preserve">应对策略</w:t>
+        <w:t>應對策略</w:t>
       </w:r>
     </w:p>
     <w:p>
@@ -5674,7 +5674,7 @@
         <w:rPr>
           <w:rFonts w:hint="eastAsia"/>
         </w:rPr>
-        <w:t xml:space="preserve">第一版只使用标准公开指标</w:t>
+        <w:t>第一版只使用標準公開指標</w:t>
       </w:r>
     </w:p>
     <w:p>
@@ -5689,7 +5689,7 @@
         <w:rPr>
           <w:rFonts w:hint="eastAsia"/>
         </w:rPr>
-        <w:t xml:space="preserve">避免过度承诺复杂金融预测功能</w:t>
+        <w:t>避免過度承諾複雜金融預測功能</w:t>
       </w:r>
     </w:p>
     <w:bookmarkEnd w:id="75"/>
@@ -5702,7 +5702,7 @@
         <w:rPr>
           <w:rFonts w:hint="eastAsia"/>
         </w:rPr>
-        <w:t xml:space="preserve">风险三：第三方数据源不稳定</w:t>
+        <w:t>風險三：第三方資料來源不穩定</w:t>
       </w:r>
     </w:p>
     <w:p>
@@ -5715,7 +5715,7 @@
           <w:b/>
           <w:bCs/>
         </w:rPr>
-        <w:t xml:space="preserve">风险描述</w:t>
+        <w:t>風險描述</w:t>
       </w:r>
       <w:r>
         <w:t xml:space="preserve"> </w:t>
@@ -5724,7 +5724,7 @@
         <w:rPr>
           <w:rFonts w:hint="eastAsia"/>
         </w:rPr>
-        <w:t xml:space="preserve">免费接口可能存在缺失值和延迟。</w:t>
+        <w:t>免費介面可能存在缺失值和延遲。</w:t>
       </w:r>
     </w:p>
     <w:p>
@@ -5737,7 +5737,7 @@
           <w:b/>
           <w:bCs/>
         </w:rPr>
-        <w:t xml:space="preserve">应对策略</w:t>
+        <w:t>應對策略</w:t>
       </w:r>
     </w:p>
     <w:p>
@@ -5752,7 +5752,7 @@
         <w:rPr>
           <w:rFonts w:hint="eastAsia"/>
         </w:rPr>
-        <w:t xml:space="preserve">做好异常处理</w:t>
+        <w:t>做好異常處理</w:t>
       </w:r>
     </w:p>
     <w:p>
@@ -5767,7 +5767,7 @@
         <w:rPr>
           <w:rFonts w:hint="eastAsia"/>
         </w:rPr>
-        <w:t xml:space="preserve">提供错误提示和</w:t>
+        <w:t>提供錯誤提示和</w:t>
       </w:r>
       <w:r>
         <w:t xml:space="preserve"> fallback </w:t>
@@ -5776,7 +5776,7 @@
         <w:rPr>
           <w:rFonts w:hint="eastAsia"/>
         </w:rPr>
-        <w:t xml:space="preserve">逻辑</w:t>
+        <w:t>邏輯</w:t>
       </w:r>
     </w:p>
     <w:bookmarkEnd w:id="76"/>
@@ -5789,7 +5789,7 @@
         <w:rPr>
           <w:rFonts w:hint="eastAsia"/>
         </w:rPr>
-        <w:t xml:space="preserve">风险四：AI</w:t>
+        <w:t>風險四：AI</w:t>
       </w:r>
       <w:r>
         <w:t xml:space="preserve"> </w:t>
@@ -5798,7 +5798,7 @@
         <w:rPr>
           <w:rFonts w:hint="eastAsia"/>
         </w:rPr>
-        <w:t xml:space="preserve">输出不准确或过度包装</w:t>
+        <w:t>輸出不準確或過度包裝</w:t>
       </w:r>
     </w:p>
     <w:p>
@@ -5811,7 +5811,7 @@
           <w:b/>
           <w:bCs/>
         </w:rPr>
-        <w:t xml:space="preserve">风险描述</w:t>
+        <w:t>風險描述</w:t>
       </w:r>
       <w:r>
         <w:t xml:space="preserve"> </w:t>
@@ -5823,7 +5823,7 @@
         <w:rPr>
           <w:rFonts w:hint="eastAsia"/>
         </w:rPr>
-        <w:t xml:space="preserve">可能输出模糊、夸张或不适当的建议。</w:t>
+        <w:t>可能輸出模糊、誇張或不適當的建議。</w:t>
       </w:r>
     </w:p>
     <w:p>
@@ -5836,7 +5836,7 @@
           <w:b/>
           <w:bCs/>
         </w:rPr>
-        <w:t xml:space="preserve">应对策略</w:t>
+        <w:t>應對策略</w:t>
       </w:r>
     </w:p>
     <w:p>
@@ -5851,7 +5851,7 @@
         <w:rPr>
           <w:rFonts w:hint="eastAsia"/>
         </w:rPr>
-        <w:t xml:space="preserve">将</w:t>
+        <w:t>將</w:t>
       </w:r>
       <w:r>
         <w:t xml:space="preserve"> AI </w:t>
@@ -5860,7 +5860,7 @@
         <w:rPr>
           <w:rFonts w:hint="eastAsia"/>
         </w:rPr>
-        <w:t xml:space="preserve">定位为解释层而非预测层</w:t>
+        <w:t>定位為解釋層而非預測層</w:t>
       </w:r>
     </w:p>
     <w:p>
@@ -5875,7 +5875,7 @@
         <w:rPr>
           <w:rFonts w:hint="eastAsia"/>
         </w:rPr>
-        <w:t xml:space="preserve">控制</w:t>
+        <w:t>控制</w:t>
       </w:r>
       <w:r>
         <w:t xml:space="preserve"> prompt </w:t>
@@ -5884,7 +5884,7 @@
         <w:rPr>
           <w:rFonts w:hint="eastAsia"/>
         </w:rPr>
-        <w:t xml:space="preserve">范围，基于真实指标生成总结</w:t>
+        <w:t>範圍，基於真實指標生成總結</w:t>
       </w:r>
     </w:p>
     <w:bookmarkEnd w:id="77"/>
@@ -5901,7 +5901,7 @@
         <w:rPr>
           <w:rFonts w:hint="eastAsia"/>
         </w:rPr>
-        <w:t xml:space="preserve">项目成功标准</w:t>
+        <w:t>專案成功標準</w:t>
       </w:r>
     </w:p>
     <w:p>
@@ -5912,7 +5912,7 @@
         <w:rPr>
           <w:rFonts w:hint="eastAsia"/>
         </w:rPr>
-        <w:t xml:space="preserve">本项目完成后，应达到以下标准：</w:t>
+        <w:t>本專案完成後，應達到以下標準：</w:t>
       </w:r>
     </w:p>
     <w:p>
@@ -5927,7 +5927,7 @@
         <w:rPr>
           <w:rFonts w:hint="eastAsia"/>
         </w:rPr>
-        <w:t xml:space="preserve">用户能够通过网页输入投资组合并得到完整分析结果</w:t>
+        <w:t>使用者能夠透過網頁輸入投資組合並得到完整分析結果</w:t>
       </w:r>
     </w:p>
     <w:p>
@@ -5942,7 +5942,7 @@
         <w:rPr>
           <w:rFonts w:hint="eastAsia"/>
         </w:rPr>
-        <w:t xml:space="preserve">系统可输出收益、风险、回撤和分散化信息</w:t>
+        <w:t>系統可輸出收益、風險、回撤和分散化資訊</w:t>
       </w:r>
     </w:p>
     <w:p>
@@ -5957,7 +5957,7 @@
         <w:rPr>
           <w:rFonts w:hint="eastAsia"/>
         </w:rPr>
-        <w:t xml:space="preserve">页面具备清晰、专业的</w:t>
+        <w:t>頁面具備清晰、專業的</w:t>
       </w:r>
       <w:r>
         <w:t xml:space="preserve"> dashboard </w:t>
@@ -5966,7 +5966,7 @@
         <w:rPr>
           <w:rFonts w:hint="eastAsia"/>
         </w:rPr>
-        <w:t xml:space="preserve">展示</w:t>
+        <w:t>展示</w:t>
       </w:r>
     </w:p>
     <w:p>
@@ -5984,7 +5984,7 @@
         <w:rPr>
           <w:rFonts w:hint="eastAsia"/>
         </w:rPr>
-        <w:t xml:space="preserve">能生成合理、易懂的解释</w:t>
+        <w:t>能生成合理、易懂的解釋</w:t>
       </w:r>
     </w:p>
     <w:p>
@@ -5999,7 +5999,7 @@
         <w:rPr>
           <w:rFonts w:hint="eastAsia"/>
         </w:rPr>
-        <w:t xml:space="preserve">项目可作为</w:t>
+        <w:t>專案可作為</w:t>
       </w:r>
       <w:r>
         <w:t xml:space="preserve"> portfolio </w:t>
@@ -6008,7 +6008,7 @@
         <w:rPr>
           <w:rFonts w:hint="eastAsia"/>
         </w:rPr>
-        <w:t xml:space="preserve">和简历展示材料</w:t>
+        <w:t>和簡歷展示材料</w:t>
       </w:r>
     </w:p>
     <w:bookmarkEnd w:id="79"/>
@@ -6024,7 +6024,7 @@
         <w:rPr>
           <w:rFonts w:hint="eastAsia"/>
         </w:rPr>
-        <w:t xml:space="preserve">可扩展路线图</w:t>
+        <w:t>可擴充套件路線圖</w:t>
       </w:r>
     </w:p>
     <w:bookmarkStart w:id="80" w:name="phase-2"/>
@@ -6033,7 +6033,7 @@
         <w:pStyle w:val="Heading4"/>
       </w:pPr>
       <w:r>
-        <w:t xml:space="preserve">Phase 2</w:t>
+        <w:t>Phase 2</w:t>
       </w:r>
     </w:p>
     <w:p>
@@ -6045,7 +6045,7 @@
         </w:numPr>
       </w:pPr>
       <w:r>
-        <w:t xml:space="preserve">Portfolio Optimization</w:t>
+        <w:t>Portfolio Optimization</w:t>
       </w:r>
     </w:p>
     <w:p>
@@ -6057,7 +6057,7 @@
         </w:numPr>
       </w:pPr>
       <w:r>
-        <w:t xml:space="preserve">Monte Carlo Simulation</w:t>
+        <w:t>Monte Carlo Simulation</w:t>
       </w:r>
     </w:p>
     <w:p>
@@ -6069,7 +6069,7 @@
         </w:numPr>
       </w:pPr>
       <w:r>
-        <w:t xml:space="preserve">Risk Contribution Analysis</w:t>
+        <w:t>Risk Contribution Analysis</w:t>
       </w:r>
     </w:p>
     <w:p>
@@ -6081,7 +6081,7 @@
         </w:numPr>
       </w:pPr>
       <w:r>
-        <w:t xml:space="preserve">Rebalancing Recommendation</w:t>
+        <w:t>Rebalancing Recommendation</w:t>
       </w:r>
     </w:p>
     <w:bookmarkEnd w:id="80"/>
@@ -6091,7 +6091,7 @@
         <w:pStyle w:val="Heading4"/>
       </w:pPr>
       <w:r>
-        <w:t xml:space="preserve">Phase 3</w:t>
+        <w:t>Phase 3</w:t>
       </w:r>
     </w:p>
     <w:p>
@@ -6106,7 +6106,7 @@
         <w:rPr>
           <w:rFonts w:hint="eastAsia"/>
         </w:rPr>
-        <w:t xml:space="preserve">基本面指标模块</w:t>
+        <w:t>基本面指標模組</w:t>
       </w:r>
     </w:p>
     <w:p>
@@ -6121,7 +6121,7 @@
         <w:rPr>
           <w:rFonts w:hint="eastAsia"/>
         </w:rPr>
-        <w:t xml:space="preserve">财经新闻情绪分析</w:t>
+        <w:t>財經新聞情緒分析</w:t>
       </w:r>
     </w:p>
     <w:p>
@@ -6136,7 +6136,7 @@
         <w:rPr>
           <w:rFonts w:hint="eastAsia"/>
         </w:rPr>
-        <w:t xml:space="preserve">行业与风格暴露分析</w:t>
+        <w:t>行業與風格暴露分析</w:t>
       </w:r>
     </w:p>
     <w:p>
@@ -6154,7 +6154,7 @@
         <w:rPr>
           <w:rFonts w:hint="eastAsia"/>
         </w:rPr>
-        <w:t xml:space="preserve">问答助手</w:t>
+        <w:t>問答助手</w:t>
       </w:r>
     </w:p>
     <w:bookmarkEnd w:id="81"/>
@@ -6171,7 +6171,7 @@
         <w:rPr>
           <w:rFonts w:hint="eastAsia"/>
         </w:rPr>
-        <w:t xml:space="preserve">预期交付物</w:t>
+        <w:t>預期交付物</w:t>
       </w:r>
     </w:p>
     <w:p>
@@ -6183,7 +6183,7 @@
         </w:numPr>
       </w:pPr>
       <w:r>
-        <w:t xml:space="preserve">Web Demo</w:t>
+        <w:t>Web Demo</w:t>
       </w:r>
     </w:p>
     <w:p>
@@ -6195,7 +6195,7 @@
         </w:numPr>
       </w:pPr>
       <w:r>
-        <w:t xml:space="preserve">GitHub Repository</w:t>
+        <w:t>GitHub Repository</w:t>
       </w:r>
     </w:p>
     <w:p>
@@ -6210,7 +6210,7 @@
         <w:rPr>
           <w:rFonts w:hint="eastAsia"/>
         </w:rPr>
-        <w:t xml:space="preserve">项目</w:t>
+        <w:t>專案</w:t>
       </w:r>
       <w:r>
         <w:t xml:space="preserve"> README</w:t>
@@ -6228,7 +6228,7 @@
         <w:rPr>
           <w:rFonts w:hint="eastAsia"/>
         </w:rPr>
-        <w:t xml:space="preserve">项目汇报</w:t>
+        <w:t>專案彙報</w:t>
       </w:r>
       <w:r>
         <w:t xml:space="preserve"> PPT </w:t>
@@ -6237,7 +6237,7 @@
         <w:rPr>
           <w:rFonts w:hint="eastAsia"/>
         </w:rPr>
-        <w:t xml:space="preserve">或报告</w:t>
+        <w:t>或報告</w:t>
       </w:r>
     </w:p>
     <w:p>
@@ -6252,7 +6252,7 @@
         <w:rPr>
           <w:rFonts w:hint="eastAsia"/>
         </w:rPr>
-        <w:t xml:space="preserve">简历项目描述</w:t>
+        <w:t>簡歷專案描述</w:t>
       </w:r>
     </w:p>
     <w:p>
@@ -6267,7 +6267,7 @@
         <w:rPr>
           <w:rFonts w:hint="eastAsia"/>
         </w:rPr>
-        <w:t xml:space="preserve">项目截图</w:t>
+        <w:t>專案截圖</w:t>
       </w:r>
     </w:p>
     <w:bookmarkEnd w:id="83"/>
@@ -6283,7 +6283,7 @@
         <w:rPr>
           <w:rFonts w:hint="eastAsia"/>
         </w:rPr>
-        <w:t xml:space="preserve">简历描述建议</w:t>
+        <w:t>簡歷描述建議</w:t>
       </w:r>
     </w:p>
     <w:p>
@@ -6296,7 +6296,7 @@
           <w:b/>
           <w:bCs/>
         </w:rPr>
-        <w:t xml:space="preserve">英文版</w:t>
+        <w:t>英文版</w:t>
       </w:r>
     </w:p>
     <w:p>
@@ -6304,7 +6304,7 @@
         <w:pStyle w:val="BodyText"/>
       </w:pPr>
       <w:r>
-        <w:t xml:space="preserve">Built an AI-enhanced portfolio analysis tool using public financial market data to evaluate return, volatility, drawdown, and diversification, with interactive visualizations and natural-language insights for investment decision support.</w:t>
+        <w:t>Built an AI-enhanced portfolio analysis tool using public financial market data to evaluate return, volatility, drawdown, and diversification, with interactive visualizations and natural-language insights for investment decision support.</w:t>
       </w:r>
     </w:p>
     <w:p>
@@ -6317,7 +6317,7 @@
           <w:b/>
           <w:bCs/>
         </w:rPr>
-        <w:t xml:space="preserve">中文版</w:t>
+        <w:t>中文版</w:t>
       </w:r>
     </w:p>
     <w:p>
@@ -6328,7 +6328,7 @@
         <w:rPr>
           <w:rFonts w:hint="eastAsia"/>
         </w:rPr>
-        <w:t xml:space="preserve">开发了一个结合</w:t>
+        <w:t>開發了一個結合</w:t>
       </w:r>
       <w:r>
         <w:t xml:space="preserve"> AI </w:t>
@@ -6337,7 +6337,7 @@
         <w:rPr>
           <w:rFonts w:hint="eastAsia"/>
         </w:rPr>
-        <w:t xml:space="preserve">解读的投资组合分析工具，基于公开金融市场数据评估收益、波动率、最大回撤与分散化情况，并通过交互式可视化和自然语言洞察支持投资分析。</w:t>
+        <w:t>解讀的投資組合分析工具，基於公開金融市場資料評估收益、波動率、最大回撤與分散化情況，並透過互動式視覺化和自然語言洞察支援投資分析。</w:t>
       </w:r>
     </w:p>
     <w:bookmarkEnd w:id="84"/>
@@ -6353,7 +6353,7 @@
         <w:rPr>
           <w:rFonts w:hint="eastAsia"/>
         </w:rPr>
-        <w:t xml:space="preserve">总结</w:t>
+        <w:t>總結</w:t>
       </w:r>
     </w:p>
     <w:p>
@@ -6364,7 +6364,7 @@
         <w:rPr>
           <w:rFonts w:hint="eastAsia"/>
         </w:rPr>
-        <w:t xml:space="preserve">该项目是一个非常适合金融和数据科学背景学生的作品集项目。它不依赖真实客户数据，具有较强的可落地性，能够较完整地体现数据分析、金融理解、产品设计和</w:t>
+        <w:t>該專案是一個非常適合金融和資料科學背景學生的作品集專案。它不依賴真實客戶資料，具有較強的可落地性，能夠較完整地體現資料分析、金融理解、產品設計和</w:t>
       </w:r>
       <w:r>
         <w:t xml:space="preserve"> AI </w:t>
@@ -6373,7 +6373,7 @@
         <w:rPr>
           <w:rFonts w:hint="eastAsia"/>
         </w:rPr>
-        <w:t xml:space="preserve">应用能力。</w:t>
+        <w:t>應用能力。</w:t>
       </w:r>
     </w:p>
     <w:p>
@@ -6384,7 +6384,7 @@
         <w:rPr>
           <w:rFonts w:hint="eastAsia"/>
         </w:rPr>
-        <w:t xml:space="preserve">从项目管理视角看，这个项目的关键在于：</w:t>
+        <w:t>從專案管理視角看，這個專案的關鍵在於：</w:t>
       </w:r>
     </w:p>
     <w:p>
@@ -6399,7 +6399,7 @@
         <w:rPr>
           <w:rFonts w:hint="eastAsia"/>
         </w:rPr>
-        <w:t xml:space="preserve">控制范围，先完成</w:t>
+        <w:t>控制範圍，先完成</w:t>
       </w:r>
       <w:r>
         <w:t xml:space="preserve"> MVP</w:t>
@@ -6417,7 +6417,7 @@
         <w:rPr>
           <w:rFonts w:hint="eastAsia"/>
         </w:rPr>
-        <w:t xml:space="preserve">聚焦价格驱动分析，避免过度复杂</w:t>
+        <w:t>聚焦價格驅動分析，避免過度複雜</w:t>
       </w:r>
     </w:p>
     <w:p>
@@ -6432,7 +6432,7 @@
         <w:rPr>
           <w:rFonts w:hint="eastAsia"/>
         </w:rPr>
-        <w:t xml:space="preserve">强调“分析</w:t>
+        <w:t>強調“分析</w:t>
       </w:r>
       <w:r>
         <w:t xml:space="preserve"> + </w:t>
@@ -6441,7 +6441,7 @@
         <w:rPr>
           <w:rFonts w:hint="eastAsia"/>
         </w:rPr>
-        <w:t xml:space="preserve">可视化</w:t>
+        <w:t>視覺化</w:t>
       </w:r>
       <w:r>
         <w:t xml:space="preserve"> + AI </w:t>
@@ -6450,7 +6450,7 @@
         <w:rPr>
           <w:rFonts w:hint="eastAsia"/>
         </w:rPr>
-        <w:t xml:space="preserve">解释”三层价值</w:t>
+        <w:t>解釋”三層價值</w:t>
       </w:r>
     </w:p>
     <w:p>
@@ -6465,7 +6465,7 @@
         <w:rPr>
           <w:rFonts w:hint="eastAsia"/>
         </w:rPr>
-        <w:t xml:space="preserve">将技术实现转化为可展示、可讲述、可交付的成果</w:t>
+        <w:t>將技術實現轉化為可展示、可講述、可交付的成果</w:t>
       </w:r>
     </w:p>
     <w:p>
@@ -6476,12 +6476,493 @@
         <w:rPr>
           <w:rFonts w:hint="eastAsia"/>
         </w:rPr>
-        <w:t xml:space="preserve">如果后续继续扩展，本项目可以逐步升级为更完整的金融智能分析平台。</w:t>
+        <w:t>如果後續繼續擴充套件，本專案可以逐步升級為更完整的金融智慧分析平臺。</w:t>
       </w:r>
     </w:p>
     <w:bookmarkEnd w:id="85"/>
     <w:bookmarkEnd w:id="86"/>
     <w:bookmarkEnd w:id="87"/>
+    <w:p>
+      <w:r>
+        <w:br w:type="page"/>
+      </w:r>
+    </w:p>
+    <w:p>
+      <w:r>
+        <w:rPr>
+          <w:b/>
+          <w:sz w:val="32"/>
+        </w:rPr>
+        <w:t>22. 網站中各項指標定義與公式說明</w:t>
+      </w:r>
+    </w:p>
+    <w:p>
+      <w:r>
+        <w:rPr>
+          <w:sz w:val="22"/>
+        </w:rPr>
+        <w:t>本節用於補充當前 Web Dashboard 中已展示或已用於分析邏輯的核心指標定義、公式來源與解讀方式，幫助讀者清楚理解頁面上每一項分析結果代表什麼。</w:t>
+      </w:r>
+    </w:p>
+    <w:p>
+      <w:r>
+        <w:rPr>
+          <w:b/>
+          <w:sz w:val="26"/>
+        </w:rPr>
+        <w:t>22.1 收益與表現類指標</w:t>
+      </w:r>
+    </w:p>
+    <w:p>
+      <w:r>
+        <w:rPr>
+          <w:sz w:val="22"/>
+        </w:rPr>
+        <w:t>• Cumulative Return（累計收益率）：表示組合在所選分析區間內從起點到終點的整體漲跌幅。公式：Cumulative Return = Π(1 + r_t) - 1，其中 r_t 為第 t 天的 portfolio daily return。</w:t>
+      </w:r>
+    </w:p>
+    <w:p>
+      <w:r>
+        <w:rPr>
+          <w:sz w:val="22"/>
+        </w:rPr>
+        <w:t>• Benchmark Return（基準累計收益率）：表示 benchmark 在相同分析區間內的累計漲跌幅，用來作為比較基準。計算方式與 cumulative return 相同。</w:t>
+      </w:r>
+    </w:p>
+    <w:p>
+      <w:r>
+        <w:rPr>
+          <w:sz w:val="22"/>
+        </w:rPr>
+        <w:t>• Relative Performance（相對錶現）：表示組合相對於 benchmark 的超額表現。公式：Relative Performance = Portfolio Cumulative Return - Benchmark Cumulative Return。</w:t>
+      </w:r>
+    </w:p>
+    <w:p>
+      <w:r>
+        <w:rPr>
+          <w:sz w:val="22"/>
+        </w:rPr>
+        <w:t>• Annualized Return（年化收益率）：將所選分析區間內的總收益率換算到一年尺度後的結果。公式：Annualized Return = (1 + Cumulative Return)^(252 / N) - 1，其中 N 為分析視窗內的交易日數量。</w:t>
+      </w:r>
+    </w:p>
+    <w:p>
+      <w:r>
+        <w:rPr>
+          <w:sz w:val="22"/>
+        </w:rPr>
+        <w:t>• Portfolio vs Benchmark Trend：該折線圖展示組合、benchmark 與各個資產自分析起點以來的累計百分比變化，方便使用者比較總體表現與個股路徑差異。</w:t>
+      </w:r>
+    </w:p>
+    <w:p>
+      <w:r>
+        <w:rPr>
+          <w:b/>
+          <w:sz w:val="26"/>
+        </w:rPr>
+        <w:t>22.2 風險、波動與尾部風險指標</w:t>
+      </w:r>
+    </w:p>
+    <w:p>
+      <w:r>
+        <w:rPr>
+          <w:sz w:val="22"/>
+        </w:rPr>
+        <w:t>• Annualized Volatility（年化波動率）：以所選分析視窗內的 daily returns 標準差為基礎，再乘以 sqrt(252) 轉換為一年尺度。公式：Annualized Volatility = std(r_daily) × sqrt(252)。這裡的 sqrt(252) 來自一年約 252 個交易日，而標準差在時間尺度轉換時應乘以期數的平方根。</w:t>
+      </w:r>
+    </w:p>
+    <w:p>
+      <w:r>
+        <w:rPr>
+          <w:sz w:val="22"/>
+        </w:rPr>
+        <w:t>• Sharpe Ratio（夏普比率）：衡量單位總波動風險下獲得了多少超額回報。公式：Sharpe = (Annualized Return - Risk Free Rate) / Annualized Volatility。</w:t>
+      </w:r>
+    </w:p>
+    <w:p>
+      <w:r>
+        <w:rPr>
+          <w:sz w:val="22"/>
+        </w:rPr>
+        <w:t>• Sortino Ratio（索提諾比率）：與 Sharpe 類似，但只懲罰下行波動，因此更聚焦 downside risk。公式：Sortino = (Annualized Return - Risk Free Rate) / Downside Deviation。</w:t>
+      </w:r>
+    </w:p>
+    <w:p>
+      <w:r>
+        <w:rPr>
+          <w:sz w:val="22"/>
+        </w:rPr>
+        <w:t>• Downside Deviation（下行偏差）：僅對負收益部分計算標準差，並進行年化，用來衡量壞波動。公式：Downside Deviation = std(r_t | r_t &lt; 0) × sqrt(252)。</w:t>
+      </w:r>
+    </w:p>
+    <w:p>
+      <w:r>
+        <w:rPr>
+          <w:sz w:val="22"/>
+        </w:rPr>
+        <w:t>• Beta vs Benchmark：衡量組合對 benchmark 波動的敏感度。公式：Beta = Cov(r_p, r_m) / Var(r_m)，其中 r_p 為組合報酬，r_m 為 benchmark 報酬。若 Beta &gt; 1，表示組合通常比市場更敏感；若 Beta &lt; 1，表示組合相對更穩健。</w:t>
+      </w:r>
+    </w:p>
+    <w:p>
+      <w:r>
+        <w:rPr>
+          <w:sz w:val="22"/>
+        </w:rPr>
+        <w:t>• Rolling Volatility：在固定滾動視窗（當前專案使用 21 個交易日）內重複計算年化波動率，觀察風險是否隨時間變大或變小。</w:t>
+      </w:r>
+    </w:p>
+    <w:p>
+      <w:r>
+        <w:rPr>
+          <w:sz w:val="22"/>
+        </w:rPr>
+        <w:t>• Rolling Beta：在固定滾動視窗內重複計算組合對 benchmark 的 Beta，觀察市場敏感度是否隨時間變化。例如某些時期更 aggressive，某些時期更 defensive。</w:t>
+      </w:r>
+    </w:p>
+    <w:p>
+      <w:r>
+        <w:rPr>
+          <w:sz w:val="22"/>
+        </w:rPr>
+        <w:t>• VaR (95%)：Value at Risk，表示在 95% 信心水平下，單日損失大致不會超過的門檻。當前專案使用 historical VaR，即取 daily return 的 5% 分位數。</w:t>
+      </w:r>
+    </w:p>
+    <w:p>
+      <w:r>
+        <w:rPr>
+          <w:sz w:val="22"/>
+        </w:rPr>
+        <w:t>• CVaR (95%) / Expected Shortfall：表示當損失真的落入最差 5% 情況時，其平均損失會是多少。公式：CVaR = E[r_t | r_t &lt;= VaR_95]。CVaR 比 VaR 更能反映尾部風險嚴重程度。</w:t>
+      </w:r>
+    </w:p>
+    <w:p>
+      <w:r>
+        <w:rPr>
+          <w:sz w:val="22"/>
+        </w:rPr>
+        <w:t>• Maximum Drawdown（最大回撤）：表示組合在分析區間內，從歷史峰值跌到後續谷底的最大累計跌幅。公式：Drawdown_t = (Wealth_t / Peak_t) - 1，Maximum Drawdown = min(Drawdown_t)。</w:t>
+      </w:r>
+    </w:p>
+    <w:p>
+      <w:r>
+        <w:rPr>
+          <w:sz w:val="22"/>
+        </w:rPr>
+        <w:t>• Worst Drawdown Periods：從 drawdown curve 中抽出最嚴重的幾個 peak-to-trough episode，並記錄開始日、谷底日、恢復日、回撤幅度與持續天數。它比單看某一天損失更能反映連續受壓時期的風險。</w:t>
+      </w:r>
+    </w:p>
+    <w:p>
+      <w:r>
+        <w:rPr>
+          <w:b/>
+          <w:sz w:val="26"/>
+        </w:rPr>
+        <w:t>22.3 分散化、相關性與集中度指標</w:t>
+      </w:r>
+    </w:p>
+    <w:p>
+      <w:r>
+        <w:rPr>
+          <w:sz w:val="22"/>
+        </w:rPr>
+        <w:t>• Correlation Matrix（相關係數矩陣）：衡量資產之間同步漲跌的程度。相關係數介於 -1 到 1 之間；越接近 1 表示越同向，越接近 -1 表示越反向，越接近 0 表示線性關係較弱。</w:t>
+      </w:r>
+    </w:p>
+    <w:p>
+      <w:r>
+        <w:rPr>
+          <w:sz w:val="22"/>
+        </w:rPr>
+        <w:t>• Correlation Heatmap：用色階將相關係數矩陣視覺化，幫助使用者一眼看出哪些資產高度同向，哪些資產更能提供分散化效果。</w:t>
+      </w:r>
+    </w:p>
+    <w:p>
+      <w:r>
+        <w:rPr>
+          <w:sz w:val="22"/>
+        </w:rPr>
+        <w:t>• Risk Contribution by Asset（資產風險貢獻度）：不是看誰權重大，而是看誰對組合總波動貢獻最大。當前專案使用 covariance-based decomposition。組合方差公式：sigma_p^2 = w^T Σ w。資產 i 的 volatility contribution 公式：RC_i = w_i (Σw)_i / sigma_p。Risk Share 進一步定義為：RC_i / sigma_p。</w:t>
+      </w:r>
+    </w:p>
+    <w:p>
+      <w:r>
+        <w:rPr>
+          <w:sz w:val="22"/>
+        </w:rPr>
+        <w:t>• Top Holding Weight：組合中單一權重最大的資產佔比。該指標幫助判斷是否存在單一持倉過重的問題。</w:t>
+      </w:r>
+    </w:p>
+    <w:p>
+      <w:r>
+        <w:rPr>
+          <w:sz w:val="22"/>
+        </w:rPr>
+        <w:t>• Top 3 Holdings：組合前三大持倉權重合計。該指標可快速反映組合是否過度依賴少數資產。</w:t>
+      </w:r>
+    </w:p>
+    <w:p>
+      <w:r>
+        <w:rPr>
+          <w:sz w:val="22"/>
+        </w:rPr>
+        <w:t>• Herfindahl Index（HHI）：衡量集中度的經典指標。公式：HHI = Σ(w_i^2)。數值越高，代表權重越集中。</w:t>
+      </w:r>
+    </w:p>
+    <w:p>
+      <w:r>
+        <w:rPr>
+          <w:sz w:val="22"/>
+        </w:rPr>
+        <w:t>• Effective Number of Holdings：用於衡量有效分散數。公式：Effective Holdings = 1 / HHI。該值越高，表示組合越接近真正分散，而不是名義上持有多支資產但風險仍然集中。</w:t>
+      </w:r>
+    </w:p>
+    <w:p>
+      <w:r>
+        <w:rPr>
+          <w:b/>
+          <w:sz w:val="26"/>
+        </w:rPr>
+        <w:t>22.4 指標解讀補充說明</w:t>
+      </w:r>
+    </w:p>
+    <w:p>
+      <w:r>
+        <w:rPr>
+          <w:sz w:val="22"/>
+        </w:rPr>
+        <w:t>• 年化指標並不是上市以來平均，而是基於當前使用者所選 lookback window（如 1y、3y、5y）內的 daily returns 估算後再換算為一年尺度。</w:t>
+      </w:r>
+    </w:p>
+    <w:p>
+      <w:r>
+        <w:rPr>
+          <w:sz w:val="22"/>
+        </w:rPr>
+        <w:t>• CVaR 與 Maximum Drawdown 不可直接互相替代：CVaR 描述的是最差單日尾部損失的平均，而 Maximum Drawdown 描述的是整個期間從峰值到谷底的累計最大跌幅。因此 CVaR 數值通常遠小於 Maximum Drawdown。</w:t>
+      </w:r>
+    </w:p>
+    <w:p>
+      <w:r>
+        <w:rPr>
+          <w:sz w:val="22"/>
+        </w:rPr>
+        <w:t>• Rolling Volatility 也不能直接等同於 Drawdown。Rolling Volatility 反映某一時期內波動高低，而 Drawdown 反映財富路徑實際發生了多深的累計回落。</w:t>
+      </w:r>
+    </w:p>
+    <w:p>
+      <w:r>
+        <w:rPr>
+          <w:b/>
+          <w:sz w:val="32"/>
+        </w:rPr>
+        <w:t>23. Scenario Analysis 設計說明與未來最佳化方向</w:t>
+      </w:r>
+    </w:p>
+    <w:p>
+      <w:r>
+        <w:rPr>
+          <w:sz w:val="22"/>
+        </w:rPr>
+        <w:t>Scenario Analysis 的核心目標不是預測未來，而是做 stress test：先假設某個情境發生，再估算 portfolio 在該情境下可能承受的影響。</w:t>
+      </w:r>
+    </w:p>
+    <w:p>
+      <w:r>
+        <w:rPr>
+          <w:b/>
+          <w:sz w:val="26"/>
+        </w:rPr>
+        <w:t>23.1 核心定義與通式</w:t>
+      </w:r>
+    </w:p>
+    <w:p>
+      <w:r>
+        <w:rPr>
+          <w:sz w:val="22"/>
+        </w:rPr>
+        <w:t>• 核心定義：Scenario Analysis = 先定義一個市場或行業情境，再為每個資產指定 shock，最後根據權重加總得到 portfolio 的情境回報。</w:t>
+      </w:r>
+    </w:p>
+    <w:p>
+      <w:r>
+        <w:rPr>
+          <w:sz w:val="22"/>
+        </w:rPr>
+        <w:t>• 核心公式：R_p(scenario) = Σ(w_i × s_i)，其中 w_i 為資產 i 的權重，s_i 為資產 i 在該情境下的 shock。</w:t>
+      </w:r>
+    </w:p>
+    <w:p>
+      <w:r>
+        <w:rPr>
+          <w:b/>
+          <w:sz w:val="26"/>
+        </w:rPr>
+        <w:t>23.2 Market Shock 定義與公式</w:t>
+      </w:r>
+    </w:p>
+    <w:p>
+      <w:r>
+        <w:rPr>
+          <w:sz w:val="22"/>
+        </w:rPr>
+        <w:t>• Market Shock 指的是整體市場發生共同衝擊，例如 benchmark 下跌 10%。</w:t>
+      </w:r>
+    </w:p>
+    <w:p>
+      <w:r>
+        <w:rPr>
+          <w:sz w:val="22"/>
+        </w:rPr>
+        <w:t>• 資產 shock 定義：s_i = beta_i^(mkt) × S_m，其中 beta_i^(mkt) = Cov(r_i, r_m) / Var(r_m)，S_m 為 benchmark shock。</w:t>
+      </w:r>
+    </w:p>
+    <w:p>
+      <w:r>
+        <w:rPr>
+          <w:sz w:val="22"/>
+        </w:rPr>
+        <w:t>• 組合在 market shock 下的回報：R_p(market) = Σ[w_i × (beta_i^(mkt) × S_m)]。</w:t>
+      </w:r>
+    </w:p>
+    <w:p>
+      <w:r>
+        <w:rPr>
+          <w:sz w:val="22"/>
+        </w:rPr>
+        <w:t>• 當前網站第一版 preset 採用 benchmark shock = -10%，並用歷史 daily returns 估計每支資產對 benchmark 的 beta。</w:t>
+      </w:r>
+    </w:p>
+    <w:p>
+      <w:r>
+        <w:rPr>
+          <w:b/>
+          <w:sz w:val="26"/>
+        </w:rPr>
+        <w:t>23.3 Sector Shock 定義與公式</w:t>
+      </w:r>
+    </w:p>
+    <w:p>
+      <w:r>
+        <w:rPr>
+          <w:sz w:val="22"/>
+        </w:rPr>
+        <w:t>• Sector Shock 指的是某一板塊發生集中衝擊，例如 Technology 下跌 10%。</w:t>
+      </w:r>
+    </w:p>
+    <w:p>
+      <w:r>
+        <w:rPr>
+          <w:sz w:val="22"/>
+        </w:rPr>
+        <w:t>• 第一版簡化規則：若單一股票屬於該 sector，則吃滿該 shock；若是 ETF，則用 sector exposure × sector shock 近似。</w:t>
+      </w:r>
+    </w:p>
+    <w:p>
+      <w:r>
+        <w:rPr>
+          <w:sz w:val="22"/>
+        </w:rPr>
+        <w:t>• 組合在 sector shock 下的回報：R_p(sector) = Σ(w_i × s_i)。</w:t>
+      </w:r>
+    </w:p>
+    <w:p>
+      <w:r>
+        <w:rPr>
+          <w:sz w:val="22"/>
+        </w:rPr>
+        <w:t>• 當前網站第一版 preset 採用 Technology Sector Shock = -10%，並用預設的科技權重近似處理 VOO、SPY、QQQ 等 ETF。</w:t>
+      </w:r>
+    </w:p>
+    <w:p>
+      <w:r>
+        <w:rPr>
+          <w:b/>
+          <w:sz w:val="26"/>
+        </w:rPr>
+        <w:t>23.4 為什麼當前版本先採用簡化版</w:t>
+      </w:r>
+    </w:p>
+    <w:p>
+      <w:r>
+        <w:rPr>
+          <w:sz w:val="22"/>
+        </w:rPr>
+        <w:t>• 第一版目標是讓使用者快速理解如果市場大跌或如果科技板塊承壓，組合可能受到多大影響，因此優先使用可解釋、可演示的 rule-based stress test。</w:t>
+      </w:r>
+    </w:p>
+    <w:p>
+      <w:r>
+        <w:rPr>
+          <w:sz w:val="22"/>
+        </w:rPr>
+        <w:t>• 這種做法優點是實現穩定、解釋成本低、容易在 dashboard 中展示；缺點是對 sector 曝險的刻畫仍然較粗略。</w:t>
+      </w:r>
+    </w:p>
+    <w:p>
+      <w:r>
+        <w:rPr>
+          <w:b/>
+          <w:sz w:val="26"/>
+        </w:rPr>
+        <w:t>23.5 後續可改進方向</w:t>
+      </w:r>
+    </w:p>
+    <w:p>
+      <w:r>
+        <w:rPr>
+          <w:sz w:val="22"/>
+        </w:rPr>
+        <w:t>• Sector Shock 進階版：引入 Sector Beta，定義為 beta_i^(sec) = Cov(r_i, r_sec) / Var(r_sec)，並以 sector ETF（如 XLK、XLF 等）作為該 sector proxy，使 sector shock 更貼近歷史敏感度。</w:t>
+      </w:r>
+    </w:p>
+    <w:p>
+      <w:r>
+        <w:rPr>
+          <w:sz w:val="22"/>
+        </w:rPr>
+        <w:t>• Custom Shock Builder：允許使用者自己輸入每支資產 shock，或自定義 benchmark shock，從而測試更個性化的 stress case。</w:t>
+      </w:r>
+    </w:p>
+    <w:p>
+      <w:r>
+        <w:rPr>
+          <w:sz w:val="22"/>
+        </w:rPr>
+        <w:t>• Macro Scenario Library：加入高利率、通脹上行、經濟衰退、美元走強等宏觀情境，使 scenario analysis 不僅限於市場或行業層面。</w:t>
+      </w:r>
+    </w:p>
+    <w:p>
+      <w:r>
+        <w:rPr>
+          <w:sz w:val="22"/>
+        </w:rPr>
+        <w:t>• Probability Layer：未來可把 scenario analysis 與 Monte Carlo Simulation 結合，讓使用者同時看到假設情境結果與隨機路徑分佈。</w:t>
+      </w:r>
+    </w:p>
+    <w:p>
+      <w:r>
+        <w:rPr>
+          <w:sz w:val="22"/>
+        </w:rPr>
+        <w:t>• Dynamic ETF Exposure：未來可接入更精細的 ETF sector composition 資料，避免使用靜態近似值。</w:t>
+      </w:r>
+    </w:p>
+    <w:p>
+      <w:r>
+        <w:rPr>
+          <w:b/>
+          <w:sz w:val="26"/>
+        </w:rPr>
+        <w:t>23.6 結論</w:t>
+      </w:r>
+    </w:p>
+    <w:p>
+      <w:r>
+        <w:rPr>
+          <w:sz w:val="22"/>
+        </w:rPr>
+        <w:t>加入 Scenario Analysis 後，專案將從歷史表現分析工具進一步升級為可進行壓力測試與假設情境評估的投資組合分析平臺。這會顯著提升產品的專業度、可展示性與後續擴充套件空間。</w:t>
+      </w:r>
+    </w:p>
     <w:sectPr>
       <w:footnotePr>
         <w:numRestart w:val="eachSect"/>

</xml_diff>